<commit_message>
Restyle EtelGebeya INSA audit package with Etel Group branding
Redesigns docs/INSA_Audit_Package_EtelGebeya.docx with the gold/carbon
brand system used across Etel Group's admin/portal surfaces: a dark
carbon cover banner with the Etel Group coin logo and gold title text,
a branded running header (logo + gold divider rule) and footer on
every body page, gold-bordered/branded table styling, gold section
dividers on every heading, and the four architecture diagrams
regenerated in the brand palette (dark carbon core process, gold
edges/borders, cream external entities) instead of generic defaults.
Content is unchanged from the previous version -- same sections,
findings, endpoint inventory, and [TO COMPLETE] placeholders.

Co-Authored-By: Claude Sonnet 5 <noreply@anthropic.com>
Claude-Session: https://claude.ai/code/session_0128uJ4AqFvT2QYuN1cWX6W6
</commit_message>
<xml_diff>
--- a/docs/INSA_Audit_Package_EtelGebeya.docx
+++ b/docs/INSA_Audit_Package_EtelGebeya.docx
@@ -2,55 +2,135 @@
 <file path=word/document.xml><?xml version="1.0" encoding="utf-8"?>
 <w:document xmlns:wpc="http://schemas.microsoft.com/office/word/2010/wordprocessingCanvas" xmlns:mc="http://schemas.openxmlformats.org/markup-compatibility/2006" xmlns:o="urn:schemas-microsoft-com:office:office" xmlns:r="http://schemas.openxmlformats.org/officeDocument/2006/relationships" xmlns:m="http://schemas.openxmlformats.org/officeDocument/2006/math" xmlns:v="urn:schemas-microsoft-com:vml" xmlns:wp14="http://schemas.microsoft.com/office/word/2010/wordprocessingDrawing" xmlns:wp="http://schemas.openxmlformats.org/drawingml/2006/wordprocessingDrawing" xmlns:w10="urn:schemas-microsoft-com:office:word" xmlns:w="http://schemas.openxmlformats.org/wordprocessingml/2006/main" xmlns:w14="http://schemas.microsoft.com/office/word/2010/wordml" xmlns:w15="http://schemas.microsoft.com/office/word/2012/wordml" xmlns:wpg="http://schemas.microsoft.com/office/word/2010/wordprocessingGroup" xmlns:wpi="http://schemas.microsoft.com/office/word/2010/wordprocessingInk" xmlns:wne="http://schemas.microsoft.com/office/word/2006/wordml" xmlns:wps="http://schemas.microsoft.com/office/word/2010/wordprocessingShape" xmlns:cx="http://schemas.microsoft.com/office/drawing/2014/chartex" xmlns:cx1="http://schemas.microsoft.com/office/drawing/2015/9/8/chartex" xmlns:cx2="http://schemas.microsoft.com/office/drawing/2015/10/21/chartex" xmlns:cx3="http://schemas.microsoft.com/office/drawing/2016/5/9/chartex" xmlns:cx4="http://schemas.microsoft.com/office/drawing/2016/5/10/chartex" xmlns:cx5="http://schemas.microsoft.com/office/drawing/2016/5/11/chartex" xmlns:cx6="http://schemas.microsoft.com/office/drawing/2016/5/12/chartex" xmlns:cx7="http://schemas.microsoft.com/office/drawing/2016/5/13/chartex" xmlns:cx8="http://schemas.microsoft.com/office/drawing/2016/5/14/chartex" xmlns:aink="http://schemas.microsoft.com/office/drawing/2016/ink" xmlns:am3d="http://schemas.microsoft.com/office/drawing/2017/model3d" xmlns:w16cex="http://schemas.microsoft.com/office/word/2018/wordml/cex" xmlns:w16cid="http://schemas.microsoft.com/office/word/2016/wordml/cid" xmlns:w16="http://schemas.microsoft.com/office/word/2018/wordml" xmlns:w16sdtdh="http://schemas.microsoft.com/office/word/2020/wordml/sdtdatahash" xmlns:w16se="http://schemas.microsoft.com/office/word/2015/wordml/symex" mc:Ignorable="w14 w15 wp14">
   <w:body>
-    <w:p>
-      <w:pPr>
-        <w:spacing w:before="2400"/>
-        <w:jc w:val="center"/>
-      </w:pPr>
-      <w:r>
-        <w:rPr>
-          <w:b/>
-          <w:bCs/>
-          <w:color w:val="9C7A2E"/>
-          <w:sz w:val="44"/>
-          <w:szCs w:val="44"/>
-        </w:rPr>
-        <w:t xml:space="preserve">INSA Web Application Security Audit Package</w:t>
-      </w:r>
-    </w:p>
-    <w:p>
-      <w:pPr>
-        <w:spacing w:after="600" w:before="200"/>
-        <w:jc w:val="center"/>
-      </w:pPr>
-      <w:r>
-        <w:rPr>
-          <w:b/>
-          <w:bCs/>
-          <w:color w:val="1B1B1B"/>
-          <w:sz w:val="32"/>
-          <w:szCs w:val="32"/>
-        </w:rPr>
-        <w:t xml:space="preserve">EtelGebeya — Etel Group Multi-Vendor Marketplace Platform</w:t>
-      </w:r>
-    </w:p>
-    <w:p>
-      <w:pPr>
-        <w:spacing w:after="200"/>
-        <w:jc w:val="center"/>
-      </w:pPr>
-      <w:r>
-        <w:rPr>
-          <w:color w:val="5D6D7E"/>
-          <w:sz w:val="24"/>
-          <w:szCs w:val="24"/>
-        </w:rPr>
-        <w:t xml:space="preserve">Prepared for submission to the Information Network Security Agency (INSA), Ethiopia</w:t>
-      </w:r>
-    </w:p>
-    <w:p>
-      <w:pPr>
-        <w:spacing w:after="200"/>
+    <w:tbl>
+      <w:tblPr>
+        <w:tblW w:type="dxa" w:w="12240"/>
+        <w:tblBorders>
+          <w:top w:val="none"/>
+          <w:left w:val="none"/>
+          <w:bottom w:val="none"/>
+          <w:right w:val="none"/>
+          <w:insideH w:val="none"/>
+          <w:insideV w:val="none"/>
+        </w:tblBorders>
+      </w:tblPr>
+      <w:tblGrid>
+        <w:gridCol w:w="12240"/>
+      </w:tblGrid>
+      <w:tr>
+        <w:tc>
+          <w:tcPr>
+            <w:tcW w:type="dxa" w:w="12240"/>
+            <w:tcBorders>
+              <w:bottom w:val="single" w:color="D4AF37" w:sz="24"/>
+            </w:tcBorders>
+            <w:shd w:fill="0D0D0D" w:color="auto" w:val="clear"/>
+            <w:tcMar>
+              <w:top w:type="dxa" w:w="1000"/>
+              <w:left w:type="dxa" w:w="900"/>
+              <w:bottom w:type="dxa" w:w="900"/>
+              <w:right w:type="dxa" w:w="900"/>
+            </w:tcMar>
+          </w:tcPr>
+          <w:p>
+            <w:pPr>
+              <w:spacing w:after="300"/>
+              <w:jc w:val="center"/>
+            </w:pPr>
+            <w:r>
+              <w:drawing>
+                <wp:inline distT="0" distB="0" distL="0" distR="0">
+                  <wp:extent cx="13335000" cy="13544550"/>
+                  <wp:effectExtent t="0" r="0" b="0" l="0"/>
+                  <wp:docPr id="1" name="" descr="" title=""/>
+                  <wp:cNvGraphicFramePr>
+                    <a:graphicFrameLocks xmlns:a="http://schemas.openxmlformats.org/drawingml/2006/main" noChangeAspect="1"/>
+                  </wp:cNvGraphicFramePr>
+                  <a:graphic xmlns:a="http://schemas.openxmlformats.org/drawingml/2006/main">
+                    <a:graphicData uri="http://schemas.openxmlformats.org/drawingml/2006/picture">
+                      <pic:pic xmlns:pic="http://schemas.openxmlformats.org/drawingml/2006/picture">
+                        <pic:nvPicPr>
+                          <pic:cNvPr id="0" name="" descr=""/>
+                          <pic:cNvPicPr>
+                            <a:picLocks noChangeAspect="1" noChangeArrowheads="1"/>
+                          </pic:cNvPicPr>
+                        </pic:nvPicPr>
+                        <pic:blipFill>
+                          <a:blip r:embed="rId9" cstate="none"/>
+                          <a:srcRect/>
+                          <a:stretch>
+                            <a:fillRect/>
+                          </a:stretch>
+                        </pic:blipFill>
+                        <pic:spPr bwMode="auto">
+                          <a:xfrm>
+                            <a:off x="0" y="0"/>
+                            <a:ext cx="13335000" cy="13544550"/>
+                          </a:xfrm>
+                          <a:prstGeom prst="rect">
+                            <a:avLst/>
+                          </a:prstGeom>
+                        </pic:spPr>
+                      </pic:pic>
+                    </a:graphicData>
+                  </a:graphic>
+                </wp:inline>
+              </w:drawing>
+            </w:r>
+          </w:p>
+          <w:p>
+            <w:pPr>
+              <w:spacing w:after="260"/>
+              <w:jc w:val="center"/>
+            </w:pPr>
+            <w:r>
+              <w:rPr>
+                <w:rFonts w:ascii="Syne" w:cs="Syne" w:eastAsia="Syne" w:hAnsi="Syne"/>
+                <w:b/>
+                <w:bCs/>
+                <w:color w:val="D4AF37"/>
+                <w:sz w:val="44"/>
+                <w:szCs w:val="44"/>
+              </w:rPr>
+              <w:t xml:space="preserve">INSA Web Application Security Audit Package</w:t>
+            </w:r>
+          </w:p>
+          <w:p>
+            <w:pPr>
+              <w:spacing w:after="400"/>
+              <w:jc w:val="center"/>
+            </w:pPr>
+            <w:r>
+              <w:rPr>
+                <w:rFonts w:ascii="Syne" w:cs="Syne" w:eastAsia="Syne" w:hAnsi="Syne"/>
+                <w:b/>
+                <w:bCs/>
+                <w:color w:val="FBF3DE"/>
+                <w:sz w:val="30"/>
+                <w:szCs w:val="30"/>
+              </w:rPr>
+              <w:t xml:space="preserve">EtelGebeya — Etel Group Multi-Vendor Marketplace Platform</w:t>
+            </w:r>
+          </w:p>
+          <w:p>
+            <w:pPr>
+              <w:jc w:val="center"/>
+            </w:pPr>
+            <w:r>
+              <w:rPr>
+                <w:color w:val="F2CC6B"/>
+                <w:sz w:val="22"/>
+                <w:szCs w:val="22"/>
+              </w:rPr>
+              <w:t xml:space="preserve">Prepared for submission to the Information Network Security Agency (INSA), Ethiopia</w:t>
+            </w:r>
+          </w:p>
+        </w:tc>
+      </w:tr>
+    </w:tbl>
+    <w:p>
+      <w:pPr>
+        <w:spacing w:before="500"/>
         <w:jc w:val="center"/>
       </w:pPr>
       <w:r>
@@ -66,13 +146,15 @@
     </w:p>
     <w:p>
       <w:pPr>
-        <w:spacing w:before="1200"/>
+        <w:spacing w:before="900"/>
         <w:jc w:val="center"/>
       </w:pPr>
       <w:r>
         <w:rPr>
+          <w:rFonts w:ascii="Syne" w:cs="Syne" w:eastAsia="Syne" w:hAnsi="Syne"/>
           <w:b/>
           <w:bCs/>
+          <w:color w:val="A07820"/>
           <w:sz w:val="24"/>
           <w:szCs w:val="24"/>
         </w:rPr>
@@ -124,6 +206,7 @@
       </w:pPr>
       <w:r>
         <w:rPr>
+          <w:rFonts w:ascii="JetBrains Mono" w:cs="JetBrains Mono" w:eastAsia="JetBrains Mono" w:hAnsi="JetBrains Mono"/>
           <w:sz w:val="22"/>
           <w:szCs w:val="22"/>
         </w:rPr>
@@ -134,7 +217,7 @@
       <w:pPr>
         <w:sectPr>
           <w:pgSz w:w="12240" w:h="15840" w:orient="portrait"/>
-          <w:pgMar w:top="1440" w:right="1440" w:bottom="1440" w:left="1440" w:header="708" w:footer="708" w:gutter="0"/>
+          <w:pgMar w:top="0" w:right="0" w:bottom="1440" w:left="0" w:header="708" w:footer="708" w:gutter="0"/>
           <w:pgNumType/>
           <w:docGrid w:linePitch="360"/>
         </w:sectPr>
@@ -143,6 +226,9 @@
     <w:p>
       <w:pPr>
         <w:pStyle w:val="Heading1"/>
+        <w:pBdr>
+          <w:bottom w:val="single" w:color="D4AF37" w:sz="8" w:space="6"/>
+        </w:pBdr>
         <w:spacing w:after="160" w:before="360"/>
       </w:pPr>
       <w:r>
@@ -195,6 +281,9 @@
     <w:p>
       <w:pPr>
         <w:pStyle w:val="Heading1"/>
+        <w:pBdr>
+          <w:bottom w:val="single" w:color="D4AF37" w:sz="8" w:space="6"/>
+        </w:pBdr>
         <w:spacing w:after="160" w:before="360"/>
       </w:pPr>
       <w:r>
@@ -213,12 +302,12 @@
       <w:tblPr>
         <w:tblW w:type="dxa" w:w="10000"/>
         <w:tblBorders>
-          <w:top w:val="single" w:color="auto" w:sz="4"/>
-          <w:left w:val="single" w:color="auto" w:sz="4"/>
-          <w:bottom w:val="single" w:color="auto" w:sz="4"/>
-          <w:right w:val="single" w:color="auto" w:sz="4"/>
-          <w:insideH w:val="single" w:color="auto" w:sz="4"/>
-          <w:insideV w:val="single" w:color="auto" w:sz="4"/>
+          <w:top w:val="single" w:color="A07820" w:sz="4"/>
+          <w:left w:val="single" w:color="A07820" w:sz="4"/>
+          <w:bottom w:val="single" w:color="A07820" w:sz="4"/>
+          <w:right w:val="single" w:color="A07820" w:sz="4"/>
+          <w:insideH w:val="single" w:color="D9C48A" w:sz="2"/>
+          <w:insideV w:val="single" w:color="D9C48A" w:sz="2"/>
         </w:tblBorders>
       </w:tblPr>
       <w:tblGrid>
@@ -232,19 +321,21 @@
         <w:tc>
           <w:tcPr>
             <w:tcW w:type="dxa" w:w="5800"/>
-            <w:shd w:fill="E8E0C8" w:color="auto" w:val="clear"/>
-            <w:tcMar>
-              <w:top w:type="dxa" w:w="80"/>
-              <w:left w:type="dxa" w:w="100"/>
-              <w:bottom w:type="dxa" w:w="80"/>
-              <w:right w:type="dxa" w:w="100"/>
-            </w:tcMar>
-          </w:tcPr>
-          <w:p>
-            <w:r>
-              <w:rPr>
+            <w:shd w:fill="0D0D0D" w:color="auto" w:val="clear"/>
+            <w:tcMar>
+              <w:top w:type="dxa" w:w="90"/>
+              <w:left w:type="dxa" w:w="110"/>
+              <w:bottom w:type="dxa" w:w="90"/>
+              <w:right w:type="dxa" w:w="110"/>
+            </w:tcMar>
+          </w:tcPr>
+          <w:p>
+            <w:r>
+              <w:rPr>
+                <w:rFonts w:ascii="Syne" w:cs="Syne" w:eastAsia="Syne" w:hAnsi="Syne"/>
                 <w:b/>
                 <w:bCs/>
+                <w:color w:val="F2CC6B"/>
                 <w:sz w:val="20"/>
                 <w:szCs w:val="20"/>
               </w:rPr>
@@ -255,19 +346,21 @@
         <w:tc>
           <w:tcPr>
             <w:tcW w:type="dxa" w:w="4200"/>
-            <w:shd w:fill="E8E0C8" w:color="auto" w:val="clear"/>
-            <w:tcMar>
-              <w:top w:type="dxa" w:w="80"/>
-              <w:left w:type="dxa" w:w="100"/>
-              <w:bottom w:type="dxa" w:w="80"/>
-              <w:right w:type="dxa" w:w="100"/>
-            </w:tcMar>
-          </w:tcPr>
-          <w:p>
-            <w:r>
-              <w:rPr>
+            <w:shd w:fill="0D0D0D" w:color="auto" w:val="clear"/>
+            <w:tcMar>
+              <w:top w:type="dxa" w:w="90"/>
+              <w:left w:type="dxa" w:w="110"/>
+              <w:bottom w:type="dxa" w:w="90"/>
+              <w:right w:type="dxa" w:w="110"/>
+            </w:tcMar>
+          </w:tcPr>
+          <w:p>
+            <w:r>
+              <w:rPr>
+                <w:rFonts w:ascii="Syne" w:cs="Syne" w:eastAsia="Syne" w:hAnsi="Syne"/>
                 <w:b/>
                 <w:bCs/>
+                <w:color w:val="F2CC6B"/>
                 <w:sz w:val="20"/>
                 <w:szCs w:val="20"/>
               </w:rPr>
@@ -281,10 +374,10 @@
           <w:tcPr>
             <w:tcW w:type="dxa" w:w="5800"/>
             <w:tcMar>
-              <w:top w:type="dxa" w:w="80"/>
-              <w:left w:type="dxa" w:w="100"/>
-              <w:bottom w:type="dxa" w:w="80"/>
-              <w:right w:type="dxa" w:w="100"/>
+              <w:top w:type="dxa" w:w="90"/>
+              <w:left w:type="dxa" w:w="110"/>
+              <w:bottom w:type="dxa" w:w="90"/>
+              <w:right w:type="dxa" w:w="110"/>
             </w:tcMar>
           </w:tcPr>
           <w:p>
@@ -303,10 +396,10 @@
           <w:tcPr>
             <w:tcW w:type="dxa" w:w="4200"/>
             <w:tcMar>
-              <w:top w:type="dxa" w:w="80"/>
-              <w:left w:type="dxa" w:w="100"/>
-              <w:bottom w:type="dxa" w:w="80"/>
-              <w:right w:type="dxa" w:w="100"/>
+              <w:top w:type="dxa" w:w="90"/>
+              <w:left w:type="dxa" w:w="110"/>
+              <w:bottom w:type="dxa" w:w="90"/>
+              <w:right w:type="dxa" w:w="110"/>
             </w:tcMar>
           </w:tcPr>
           <w:p>
@@ -326,11 +419,12 @@
         <w:tc>
           <w:tcPr>
             <w:tcW w:type="dxa" w:w="5800"/>
-            <w:tcMar>
-              <w:top w:type="dxa" w:w="80"/>
-              <w:left w:type="dxa" w:w="100"/>
-              <w:bottom w:type="dxa" w:w="80"/>
-              <w:right w:type="dxa" w:w="100"/>
+            <w:shd w:fill="FBF6E8" w:color="auto" w:val="clear"/>
+            <w:tcMar>
+              <w:top w:type="dxa" w:w="90"/>
+              <w:left w:type="dxa" w:w="110"/>
+              <w:bottom w:type="dxa" w:w="90"/>
+              <w:right w:type="dxa" w:w="110"/>
             </w:tcMar>
           </w:tcPr>
           <w:p>
@@ -348,11 +442,12 @@
         <w:tc>
           <w:tcPr>
             <w:tcW w:type="dxa" w:w="4200"/>
-            <w:tcMar>
-              <w:top w:type="dxa" w:w="80"/>
-              <w:left w:type="dxa" w:w="100"/>
-              <w:bottom w:type="dxa" w:w="80"/>
-              <w:right w:type="dxa" w:w="100"/>
+            <w:shd w:fill="FBF6E8" w:color="auto" w:val="clear"/>
+            <w:tcMar>
+              <w:top w:type="dxa" w:w="90"/>
+              <w:left w:type="dxa" w:w="110"/>
+              <w:bottom w:type="dxa" w:w="90"/>
+              <w:right w:type="dxa" w:w="110"/>
             </w:tcMar>
           </w:tcPr>
           <w:p>
@@ -373,10 +468,10 @@
           <w:tcPr>
             <w:tcW w:type="dxa" w:w="5800"/>
             <w:tcMar>
-              <w:top w:type="dxa" w:w="80"/>
-              <w:left w:type="dxa" w:w="100"/>
-              <w:bottom w:type="dxa" w:w="80"/>
-              <w:right w:type="dxa" w:w="100"/>
+              <w:top w:type="dxa" w:w="90"/>
+              <w:left w:type="dxa" w:w="110"/>
+              <w:bottom w:type="dxa" w:w="90"/>
+              <w:right w:type="dxa" w:w="110"/>
             </w:tcMar>
           </w:tcPr>
           <w:p>
@@ -395,10 +490,10 @@
           <w:tcPr>
             <w:tcW w:type="dxa" w:w="4200"/>
             <w:tcMar>
-              <w:top w:type="dxa" w:w="80"/>
-              <w:left w:type="dxa" w:w="100"/>
-              <w:bottom w:type="dxa" w:w="80"/>
-              <w:right w:type="dxa" w:w="100"/>
+              <w:top w:type="dxa" w:w="90"/>
+              <w:left w:type="dxa" w:w="110"/>
+              <w:bottom w:type="dxa" w:w="90"/>
+              <w:right w:type="dxa" w:w="110"/>
             </w:tcMar>
           </w:tcPr>
           <w:p>
@@ -426,6 +521,9 @@
     <w:p>
       <w:pPr>
         <w:pStyle w:val="Heading1"/>
+        <w:pBdr>
+          <w:bottom w:val="single" w:color="D4AF37" w:sz="8" w:space="6"/>
+        </w:pBdr>
         <w:spacing w:after="160" w:before="360"/>
       </w:pPr>
       <w:r>
@@ -456,85 +554,7 @@
       <w:r>
         <w:drawing>
           <wp:inline distT="0" distB="0" distL="0" distR="0">
-            <wp:extent cx="64770000" cy="13773150"/>
-            <wp:effectExtent t="0" r="0" b="0" l="0"/>
-            <wp:docPr id="1" name="" descr="" title=""/>
-            <wp:cNvGraphicFramePr>
-              <a:graphicFrameLocks xmlns:a="http://schemas.openxmlformats.org/drawingml/2006/main" noChangeAspect="1"/>
-            </wp:cNvGraphicFramePr>
-            <a:graphic xmlns:a="http://schemas.openxmlformats.org/drawingml/2006/main">
-              <a:graphicData uri="http://schemas.openxmlformats.org/drawingml/2006/picture">
-                <pic:pic xmlns:pic="http://schemas.openxmlformats.org/drawingml/2006/picture">
-                  <pic:nvPicPr>
-                    <pic:cNvPr id="0" name="" descr=""/>
-                    <pic:cNvPicPr>
-                      <a:picLocks noChangeAspect="1" noChangeArrowheads="1"/>
-                    </pic:cNvPicPr>
-                  </pic:nvPicPr>
-                  <pic:blipFill>
-                    <a:blip r:embed="rId9" cstate="none"/>
-                    <a:srcRect/>
-                    <a:stretch>
-                      <a:fillRect/>
-                    </a:stretch>
-                  </pic:blipFill>
-                  <pic:spPr bwMode="auto">
-                    <a:xfrm>
-                      <a:off x="0" y="0"/>
-                      <a:ext cx="64770000" cy="13773150"/>
-                    </a:xfrm>
-                    <a:prstGeom prst="rect">
-                      <a:avLst/>
-                    </a:prstGeom>
-                  </pic:spPr>
-                </pic:pic>
-              </a:graphicData>
-            </a:graphic>
-          </wp:inline>
-        </w:drawing>
-      </w:r>
-    </w:p>
-    <w:p>
-      <w:pPr>
-        <w:spacing w:after="300" w:before="80"/>
-        <w:jc w:val="center"/>
-      </w:pPr>
-      <w:r>
-        <w:rPr>
-          <w:i/>
-          <w:iCs/>
-          <w:color w:val="5D6D7E"/>
-          <w:sz w:val="20"/>
-          <w:szCs w:val="20"/>
-        </w:rPr>
-        <w:t xml:space="preserve">Figure 1 — Context-level Data Flow Diagram (Level 0)</w:t>
-      </w:r>
-    </w:p>
-    <w:p>
-      <w:pPr>
-        <w:pStyle w:val="Heading2"/>
-        <w:spacing w:after="140" w:before="280"/>
-      </w:pPr>
-      <w:r>
-        <w:t xml:space="preserve">2.2 Data Flow Diagram — Detailed (Level 1)</w:t>
-      </w:r>
-    </w:p>
-    <w:p>
-      <w:pPr>
-        <w:spacing w:after="160"/>
-      </w:pPr>
-      <w:r>
-        <w:t xml:space="preserve">Breaks the single EtelGebeya process into its five main functional processes (storefront/cart, checkout/escrow, order fulfillment, vendor panel, admin panel) and the database tables each one reads from or writes to.</w:t>
-      </w:r>
-    </w:p>
-    <w:p>
-      <w:pPr>
-        <w:jc w:val="center"/>
-      </w:pPr>
-      <w:r>
-        <w:drawing>
-          <wp:inline distT="0" distB="0" distL="0" distR="0">
-            <wp:extent cx="53340000" cy="13849350"/>
+            <wp:extent cx="64770000" cy="13658850"/>
             <wp:effectExtent t="0" r="0" b="0" l="0"/>
             <wp:docPr id="1" name="" descr="" title=""/>
             <wp:cNvGraphicFramePr>
@@ -559,7 +579,7 @@
                   <pic:spPr bwMode="auto">
                     <a:xfrm>
                       <a:off x="0" y="0"/>
-                      <a:ext cx="53340000" cy="13849350"/>
+                      <a:ext cx="64770000" cy="13658850"/>
                     </a:xfrm>
                     <a:prstGeom prst="rect">
                       <a:avLst/>
@@ -585,7 +605,7 @@
           <w:sz w:val="20"/>
           <w:szCs w:val="20"/>
         </w:rPr>
-        <w:t xml:space="preserve">Figure 2 — Detailed Data Flow Diagram (Level 1)</w:t>
+        <w:t xml:space="preserve">Figure 1 — Context-level Data Flow Diagram (Level 0)</w:t>
       </w:r>
     </w:p>
     <w:p>
@@ -594,7 +614,7 @@
         <w:spacing w:after="140" w:before="280"/>
       </w:pPr>
       <w:r>
-        <w:t xml:space="preserve">2.3 System Architecture Diagram</w:t>
+        <w:t xml:space="preserve">2.2 Data Flow Diagram — Detailed (Level 1)</w:t>
       </w:r>
     </w:p>
     <w:p>
@@ -602,7 +622,7 @@
         <w:spacing w:after="160"/>
       </w:pPr>
       <w:r>
-        <w:t xml:space="preserve">EtelGebeya runs as a routed PHP 8.1 MVC application (public/index.php -&gt; App\Core\Router -&gt; app/Controllers) on the same shared cPanel hosting account as the rest of the Etel Group stack, with its own MySQL database. A separate legacy flat action-dispatch API (api/admin.php) drives the static admin.html/admin-panel.js dashboard the platform team actually uses day to day, running alongside the newer MVC-routed /admin/* pages.</w:t>
+        <w:t xml:space="preserve">Breaks the single EtelGebeya process into its five main functional processes (storefront/cart, checkout/escrow, order fulfillment, vendor panel, admin panel) and the database tables each one reads from or writes to.</w:t>
       </w:r>
     </w:p>
     <w:p>
@@ -612,7 +632,7 @@
       <w:r>
         <w:drawing>
           <wp:inline distT="0" distB="0" distL="0" distR="0">
-            <wp:extent cx="64770000" cy="41109900"/>
+            <wp:extent cx="53340000" cy="13849350"/>
             <wp:effectExtent t="0" r="0" b="0" l="0"/>
             <wp:docPr id="1" name="" descr="" title=""/>
             <wp:cNvGraphicFramePr>
@@ -637,7 +657,7 @@
                   <pic:spPr bwMode="auto">
                     <a:xfrm>
                       <a:off x="0" y="0"/>
-                      <a:ext cx="64770000" cy="41109900"/>
+                      <a:ext cx="53340000" cy="13849350"/>
                     </a:xfrm>
                     <a:prstGeom prst="rect">
                       <a:avLst/>
@@ -663,155 +683,7 @@
           <w:sz w:val="20"/>
           <w:szCs w:val="20"/>
         </w:rPr>
-        <w:t xml:space="preserve">Figure 3 — System Architecture Diagram</w:t>
-      </w:r>
-    </w:p>
-    <w:p>
-      <w:pPr>
-        <w:pStyle w:val="Heading3"/>
-        <w:spacing w:after="100" w:before="220"/>
-      </w:pPr>
-      <w:r>
-        <w:t xml:space="preserve">Security layers already in place</w:t>
-      </w:r>
-    </w:p>
-    <w:p>
-      <w:pPr>
-        <w:pStyle w:val="ListParagraph"/>
-        <w:numPr>
-          <w:ilvl w:val="0"/>
-          <w:numId w:val="1"/>
-        </w:numPr>
-        <w:spacing w:after="80"/>
-      </w:pPr>
-      <w:r>
-        <w:t xml:space="preserve">Authorization enforced server-side on every controller action, never relied on client-side (JS) checks alone — AdminController gates every action through a constructor guard() (login + isAdmin()), VendorController scopes every query to the caller's own seller_id, CustomerController scopes every query to the caller's own user_id.</w:t>
-      </w:r>
-    </w:p>
-    <w:p>
-      <w:pPr>
-        <w:pStyle w:val="ListParagraph"/>
-        <w:numPr>
-          <w:ilvl w:val="0"/>
-          <w:numId w:val="1"/>
-        </w:numPr>
-        <w:spacing w:after="80"/>
-      </w:pPr>
-      <w:r>
-        <w:t xml:space="preserve">All database access is fully parameterized (PDO with PDO::ATTR_EMULATE_PREPARES =&gt; false); a full sweep of every query in every controller/model found zero instances of unwhitelisted dynamic SQL.</w:t>
-      </w:r>
-    </w:p>
-    <w:p>
-      <w:pPr>
-        <w:pStyle w:val="ListParagraph"/>
-        <w:numPr>
-          <w:ilvl w:val="0"/>
-          <w:numId w:val="1"/>
-        </w:numPr>
-        <w:spacing w:after="80"/>
-      </w:pPr>
-      <w:r>
-        <w:t xml:space="preserve">Consistent output escaping — every render path that touches account-holder-chosen free text routes through a single global e() helper (htmlspecialchars with ENT_QUOTES | ENT_SUBSTITUTE), including the legacy admin-panel.js dashboard's own hoisted e() function.</w:t>
-      </w:r>
-    </w:p>
-    <w:p>
-      <w:pPr>
-        <w:pStyle w:val="ListParagraph"/>
-        <w:numPr>
-          <w:ilvl w:val="0"/>
-          <w:numId w:val="1"/>
-        </w:numPr>
-        <w:spacing w:after="80"/>
-      </w:pPr>
-      <w:r>
-        <w:t xml:space="preserve">Session cookies set httponly, SameSite=Strict, and conditionally secure; session ID regenerated on login (session_regenerate_id(true)); a banned account's session is invalidated on its very next request, not just at next login.</w:t>
-      </w:r>
-    </w:p>
-    <w:p>
-      <w:pPr>
-        <w:pStyle w:val="ListParagraph"/>
-        <w:numPr>
-          <w:ilvl w:val="0"/>
-          <w:numId w:val="1"/>
-        </w:numPr>
-        <w:spacing w:after="80"/>
-      </w:pPr>
-      <w:r>
-        <w:t xml:space="preserve">CSRF tokens (32 random bytes, hash_equals() comparison) required on state-changing MVC actions; the legacy api/admin.php requires either the timing-safe-compared master secret or a real per-admin session token scoped by capability.</w:t>
-      </w:r>
-    </w:p>
-    <w:p>
-      <w:pPr>
-        <w:pStyle w:val="ListParagraph"/>
-        <w:numPr>
-          <w:ilvl w:val="0"/>
-          <w:numId w:val="1"/>
-        </w:numPr>
-        <w:spacing w:after="80"/>
-      </w:pPr>
-      <w:r>
-        <w:t xml:space="preserve">Checkout totals and escrow payments are re-derived and re-verified entirely server-side (EtelPayClient::verifyEscrowTx()/verifyTx()) — the client's displayed total/discount/tx_ref is never trusted on its own.</w:t>
-      </w:r>
-    </w:p>
-    <w:p>
-      <w:pPr>
-        <w:pStyle w:val="ListParagraph"/>
-        <w:numPr>
-          <w:ilvl w:val="0"/>
-          <w:numId w:val="1"/>
-        </w:numPr>
-        <w:spacing w:after="80"/>
-      </w:pPr>
-      <w:r>
-        <w:t xml:space="preserve">Login rate limiting (5 failures / 15 min per IP, 10 failures / 15 min per email) against a login_attempts table before allowing another attempt.</w:t>
-      </w:r>
-    </w:p>
-    <w:p>
-      <w:pPr>
-        <w:pStyle w:val="Heading3"/>
-        <w:spacing w:after="100" w:before="220"/>
-      </w:pPr>
-      <w:r>
-        <w:t xml:space="preserve">Known open items (disclose — INSA audits are more useful when these are flagged upfront, not discovered)</w:t>
-      </w:r>
-    </w:p>
-    <w:p>
-      <w:pPr>
-        <w:pStyle w:val="ListParagraph"/>
-        <w:numPr>
-          <w:ilvl w:val="0"/>
-          <w:numId w:val="1"/>
-        </w:numPr>
-        <w:spacing w:after="80"/>
-      </w:pPr>
-      <w:r>
-        <w:t xml:space="preserve">PaymentController and CourierController are referenced by the router (/payments/*, /courier/* routes) but the controller classes do not exist in the codebase — hitting those routes currently throws and is caught by a generic 500 handler. Not an exposure in itself, but these are dead code paths rather than "gated and safe" routes; needs a decision on whether they are upcoming features or should be removed from the router.</w:t>
-      </w:r>
-    </w:p>
-    <w:p>
-      <w:pPr>
-        <w:pStyle w:val="ListParagraph"/>
-        <w:numPr>
-          <w:ilvl w:val="0"/>
-          <w:numId w:val="1"/>
-        </w:numPr>
-        <w:spacing w:after="80"/>
-      </w:pPr>
-      <w:r>
-        <w:t xml:space="preserve">/checkout/success/{code} looks up an order by its ref code alone with no session/ownership check — a deliberate "guest checkout receipt page" pattern common to e-commerce sites, but the order code's ~24 bits of entropy is worth a conscious sizing decision at the platform's expected scale rather than an unexamined default.</w:t>
-      </w:r>
-    </w:p>
-    <w:p>
-      <w:pPr>
-        <w:spacing w:after="160"/>
-      </w:pPr>
-      <w:r>
-        <w:rPr>
-          <w:i/>
-          <w:iCs/>
-          <w:color w:val="C0392B"/>
-        </w:rPr>
-        <w:t xml:space="preserve">[TO COMPLETE: Confirm whether shared cPanel hosting for ethelmarket.com currently restricts inbound traffic to a known CDN/proxy range, or document that it does not (accepted risk) — same open item already disclosed in the ETEL-ID and Delivery &amp; Ride submissions.]</w:t>
+        <w:t xml:space="preserve">Figure 2 — Detailed Data Flow Diagram (Level 1)</w:t>
       </w:r>
     </w:p>
     <w:p>
@@ -820,7 +692,7 @@
         <w:spacing w:after="140" w:before="280"/>
       </w:pPr>
       <w:r>
-        <w:t xml:space="preserve">2.4 Entity Relationship Diagram (ERD)</w:t>
+        <w:t xml:space="preserve">2.3 System Architecture Diagram</w:t>
       </w:r>
     </w:p>
     <w:p>
@@ -828,7 +700,7 @@
         <w:spacing w:after="160"/>
       </w:pPr>
       <w:r>
-        <w:t xml:space="preserve">Core tables: eg_users (customers and vendor owners), eg_vendors (one row per approved seller, linked 1:1 to a user), eg_products / eg_product_images / eg_product_variants (vendor catalog), eg_orders / eg_order_items / eg_order_vendors (a single checkout can span multiple vendors, split per-vendor), eg_payments (escrow transaction records), eg_vendor_payouts (admin-approved vendor withdrawals), and eg_reviews (one review per product per customer, enforced server-side).</w:t>
+        <w:t xml:space="preserve">EtelGebeya runs as a routed PHP 8.1 MVC application (public/index.php -&gt; App\Core\Router -&gt; app/Controllers) on the same shared cPanel hosting account as the rest of the Etel Group stack, with its own MySQL database. A separate legacy flat action-dispatch API (api/admin.php) drives the static admin.html/admin-panel.js dashboard the platform team actually uses day to day, running alongside the newer MVC-routed /admin/* pages.</w:t>
       </w:r>
     </w:p>
     <w:p>
@@ -838,7 +710,7 @@
       <w:r>
         <w:drawing>
           <wp:inline distT="0" distB="0" distL="0" distR="0">
-            <wp:extent cx="64770000" cy="22640925"/>
+            <wp:extent cx="64770000" cy="38881050"/>
             <wp:effectExtent t="0" r="0" b="0" l="0"/>
             <wp:docPr id="1" name="" descr="" title=""/>
             <wp:cNvGraphicFramePr>
@@ -863,7 +735,7 @@
                   <pic:spPr bwMode="auto">
                     <a:xfrm>
                       <a:off x="0" y="0"/>
-                      <a:ext cx="64770000" cy="22640925"/>
+                      <a:ext cx="64770000" cy="38881050"/>
                     </a:xfrm>
                     <a:prstGeom prst="rect">
                       <a:avLst/>
@@ -889,12 +761,241 @@
           <w:sz w:val="20"/>
           <w:szCs w:val="20"/>
         </w:rPr>
+        <w:t xml:space="preserve">Figure 3 — System Architecture Diagram</w:t>
+      </w:r>
+    </w:p>
+    <w:p>
+      <w:pPr>
+        <w:pStyle w:val="Heading3"/>
+        <w:spacing w:after="100" w:before="220"/>
+      </w:pPr>
+      <w:r>
+        <w:t xml:space="preserve">Security layers already in place</w:t>
+      </w:r>
+    </w:p>
+    <w:p>
+      <w:pPr>
+        <w:pStyle w:val="ListParagraph"/>
+        <w:numPr>
+          <w:ilvl w:val="0"/>
+          <w:numId w:val="1"/>
+        </w:numPr>
+        <w:spacing w:after="80"/>
+      </w:pPr>
+      <w:r>
+        <w:t xml:space="preserve">Authorization enforced server-side on every controller action, never relied on client-side (JS) checks alone — AdminController gates every action through a constructor guard() (login + isAdmin()), VendorController scopes every query to the caller's own seller_id, CustomerController scopes every query to the caller's own user_id.</w:t>
+      </w:r>
+    </w:p>
+    <w:p>
+      <w:pPr>
+        <w:pStyle w:val="ListParagraph"/>
+        <w:numPr>
+          <w:ilvl w:val="0"/>
+          <w:numId w:val="1"/>
+        </w:numPr>
+        <w:spacing w:after="80"/>
+      </w:pPr>
+      <w:r>
+        <w:t xml:space="preserve">All database access is fully parameterized (PDO with PDO::ATTR_EMULATE_PREPARES =&gt; false); a full sweep of every query in every controller/model found zero instances of unwhitelisted dynamic SQL.</w:t>
+      </w:r>
+    </w:p>
+    <w:p>
+      <w:pPr>
+        <w:pStyle w:val="ListParagraph"/>
+        <w:numPr>
+          <w:ilvl w:val="0"/>
+          <w:numId w:val="1"/>
+        </w:numPr>
+        <w:spacing w:after="80"/>
+      </w:pPr>
+      <w:r>
+        <w:t xml:space="preserve">Consistent output escaping — every render path that touches account-holder-chosen free text routes through a single global e() helper (htmlspecialchars with ENT_QUOTES | ENT_SUBSTITUTE), including the legacy admin-panel.js dashboard's own hoisted e() function.</w:t>
+      </w:r>
+    </w:p>
+    <w:p>
+      <w:pPr>
+        <w:pStyle w:val="ListParagraph"/>
+        <w:numPr>
+          <w:ilvl w:val="0"/>
+          <w:numId w:val="1"/>
+        </w:numPr>
+        <w:spacing w:after="80"/>
+      </w:pPr>
+      <w:r>
+        <w:t xml:space="preserve">Session cookies set httponly, SameSite=Strict, and conditionally secure; session ID regenerated on login (session_regenerate_id(true)); a banned account's session is invalidated on its very next request, not just at next login.</w:t>
+      </w:r>
+    </w:p>
+    <w:p>
+      <w:pPr>
+        <w:pStyle w:val="ListParagraph"/>
+        <w:numPr>
+          <w:ilvl w:val="0"/>
+          <w:numId w:val="1"/>
+        </w:numPr>
+        <w:spacing w:after="80"/>
+      </w:pPr>
+      <w:r>
+        <w:t xml:space="preserve">CSRF tokens (32 random bytes, hash_equals() comparison) required on state-changing MVC actions; the legacy api/admin.php requires either the timing-safe-compared master secret or a real per-admin session token scoped by capability.</w:t>
+      </w:r>
+    </w:p>
+    <w:p>
+      <w:pPr>
+        <w:pStyle w:val="ListParagraph"/>
+        <w:numPr>
+          <w:ilvl w:val="0"/>
+          <w:numId w:val="1"/>
+        </w:numPr>
+        <w:spacing w:after="80"/>
+      </w:pPr>
+      <w:r>
+        <w:t xml:space="preserve">Checkout totals and escrow payments are re-derived and re-verified entirely server-side (EtelPayClient::verifyEscrowTx()/verifyTx()) — the client's displayed total/discount/tx_ref is never trusted on its own.</w:t>
+      </w:r>
+    </w:p>
+    <w:p>
+      <w:pPr>
+        <w:pStyle w:val="ListParagraph"/>
+        <w:numPr>
+          <w:ilvl w:val="0"/>
+          <w:numId w:val="1"/>
+        </w:numPr>
+        <w:spacing w:after="80"/>
+      </w:pPr>
+      <w:r>
+        <w:t xml:space="preserve">Login rate limiting (5 failures / 15 min per IP, 10 failures / 15 min per email) against a login_attempts table before allowing another attempt.</w:t>
+      </w:r>
+    </w:p>
+    <w:p>
+      <w:pPr>
+        <w:pStyle w:val="Heading3"/>
+        <w:spacing w:after="100" w:before="220"/>
+      </w:pPr>
+      <w:r>
+        <w:t xml:space="preserve">Known open items (disclose — INSA audits are more useful when these are flagged upfront, not discovered)</w:t>
+      </w:r>
+    </w:p>
+    <w:p>
+      <w:pPr>
+        <w:pStyle w:val="ListParagraph"/>
+        <w:numPr>
+          <w:ilvl w:val="0"/>
+          <w:numId w:val="1"/>
+        </w:numPr>
+        <w:spacing w:after="80"/>
+      </w:pPr>
+      <w:r>
+        <w:t xml:space="preserve">PaymentController and CourierController are referenced by the router (/payments/*, /courier/* routes) but the controller classes do not exist in the codebase — hitting those routes currently throws and is caught by a generic 500 handler. Not an exposure in itself, but these are dead code paths rather than "gated and safe" routes; needs a decision on whether they are upcoming features or should be removed from the router.</w:t>
+      </w:r>
+    </w:p>
+    <w:p>
+      <w:pPr>
+        <w:pStyle w:val="ListParagraph"/>
+        <w:numPr>
+          <w:ilvl w:val="0"/>
+          <w:numId w:val="1"/>
+        </w:numPr>
+        <w:spacing w:after="80"/>
+      </w:pPr>
+      <w:r>
+        <w:t xml:space="preserve">/checkout/success/{code} looks up an order by its ref code alone with no session/ownership check — a deliberate "guest checkout receipt page" pattern common to e-commerce sites, but the order code's ~24 bits of entropy is worth a conscious sizing decision at the platform's expected scale rather than an unexamined default.</w:t>
+      </w:r>
+    </w:p>
+    <w:p>
+      <w:pPr>
+        <w:spacing w:after="160"/>
+      </w:pPr>
+      <w:r>
+        <w:rPr>
+          <w:i/>
+          <w:iCs/>
+          <w:color w:val="C0392B"/>
+        </w:rPr>
+        <w:t xml:space="preserve">[TO COMPLETE: Confirm whether shared cPanel hosting for ethelmarket.com currently restricts inbound traffic to a known CDN/proxy range, or document that it does not (accepted risk) — same open item already disclosed in the ETEL-ID and Delivery &amp; Ride submissions.]</w:t>
+      </w:r>
+    </w:p>
+    <w:p>
+      <w:pPr>
+        <w:pStyle w:val="Heading2"/>
+        <w:spacing w:after="140" w:before="280"/>
+      </w:pPr>
+      <w:r>
+        <w:t xml:space="preserve">2.4 Entity Relationship Diagram (ERD)</w:t>
+      </w:r>
+    </w:p>
+    <w:p>
+      <w:pPr>
+        <w:spacing w:after="160"/>
+      </w:pPr>
+      <w:r>
+        <w:t xml:space="preserve">Core tables: eg_users (customers and vendor owners), eg_vendors (one row per approved seller, linked 1:1 to a user), eg_products / eg_product_images / eg_product_variants (vendor catalog), eg_orders / eg_order_items / eg_order_vendors (a single checkout can span multiple vendors, split per-vendor), eg_payments (escrow transaction records), eg_vendor_payouts (admin-approved vendor withdrawals), and eg_reviews (one review per product per customer, enforced server-side).</w:t>
+      </w:r>
+    </w:p>
+    <w:p>
+      <w:pPr>
+        <w:jc w:val="center"/>
+      </w:pPr>
+      <w:r>
+        <w:drawing>
+          <wp:inline distT="0" distB="0" distL="0" distR="0">
+            <wp:extent cx="64770000" cy="23079075"/>
+            <wp:effectExtent t="0" r="0" b="0" l="0"/>
+            <wp:docPr id="1" name="" descr="" title=""/>
+            <wp:cNvGraphicFramePr>
+              <a:graphicFrameLocks xmlns:a="http://schemas.openxmlformats.org/drawingml/2006/main" noChangeAspect="1"/>
+            </wp:cNvGraphicFramePr>
+            <a:graphic xmlns:a="http://schemas.openxmlformats.org/drawingml/2006/main">
+              <a:graphicData uri="http://schemas.openxmlformats.org/drawingml/2006/picture">
+                <pic:pic xmlns:pic="http://schemas.openxmlformats.org/drawingml/2006/picture">
+                  <pic:nvPicPr>
+                    <pic:cNvPr id="0" name="" descr=""/>
+                    <pic:cNvPicPr>
+                      <a:picLocks noChangeAspect="1" noChangeArrowheads="1"/>
+                    </pic:cNvPicPr>
+                  </pic:nvPicPr>
+                  <pic:blipFill>
+                    <a:blip r:embed="rId13" cstate="none"/>
+                    <a:srcRect/>
+                    <a:stretch>
+                      <a:fillRect/>
+                    </a:stretch>
+                  </pic:blipFill>
+                  <pic:spPr bwMode="auto">
+                    <a:xfrm>
+                      <a:off x="0" y="0"/>
+                      <a:ext cx="64770000" cy="23079075"/>
+                    </a:xfrm>
+                    <a:prstGeom prst="rect">
+                      <a:avLst/>
+                    </a:prstGeom>
+                  </pic:spPr>
+                </pic:pic>
+              </a:graphicData>
+            </a:graphic>
+          </wp:inline>
+        </w:drawing>
+      </w:r>
+    </w:p>
+    <w:p>
+      <w:pPr>
+        <w:spacing w:after="300" w:before="80"/>
+        <w:jc w:val="center"/>
+      </w:pPr>
+      <w:r>
+        <w:rPr>
+          <w:i/>
+          <w:iCs/>
+          <w:color w:val="5D6D7E"/>
+          <w:sz w:val="20"/>
+          <w:szCs w:val="20"/>
+        </w:rPr>
         <w:t xml:space="preserve">Figure 4 — Entity Relationship Diagram (ERD)</w:t>
       </w:r>
     </w:p>
     <w:p>
       <w:pPr>
         <w:pStyle w:val="Heading1"/>
+        <w:pBdr>
+          <w:bottom w:val="single" w:color="D4AF37" w:sz="8" w:space="6"/>
+        </w:pBdr>
         <w:spacing w:after="160" w:before="360"/>
       </w:pPr>
       <w:r>
@@ -995,6 +1096,9 @@
     <w:p>
       <w:pPr>
         <w:pStyle w:val="Heading1"/>
+        <w:pBdr>
+          <w:bottom w:val="single" w:color="D4AF37" w:sz="8" w:space="6"/>
+        </w:pBdr>
         <w:spacing w:after="160" w:before="360"/>
       </w:pPr>
       <w:r>
@@ -1033,6 +1137,9 @@
     <w:p>
       <w:pPr>
         <w:pStyle w:val="Heading1"/>
+        <w:pBdr>
+          <w:bottom w:val="single" w:color="D4AF37" w:sz="8" w:space="6"/>
+        </w:pBdr>
         <w:spacing w:after="160" w:before="360"/>
       </w:pPr>
       <w:r>
@@ -1295,6 +1402,9 @@
     <w:p>
       <w:pPr>
         <w:pStyle w:val="Heading1"/>
+        <w:pBdr>
+          <w:bottom w:val="single" w:color="D4AF37" w:sz="8" w:space="6"/>
+        </w:pBdr>
         <w:spacing w:after="160" w:before="360"/>
       </w:pPr>
       <w:r>
@@ -1325,6 +1435,9 @@
     <w:p>
       <w:pPr>
         <w:pStyle w:val="Heading1"/>
+        <w:pBdr>
+          <w:bottom w:val="single" w:color="D4AF37" w:sz="8" w:space="6"/>
+        </w:pBdr>
         <w:spacing w:after="160" w:before="360"/>
       </w:pPr>
       <w:r>
@@ -1343,12 +1456,12 @@
       <w:tblPr>
         <w:tblW w:type="dxa" w:w="10000"/>
         <w:tblBorders>
-          <w:top w:val="single" w:color="auto" w:sz="4"/>
-          <w:left w:val="single" w:color="auto" w:sz="4"/>
-          <w:bottom w:val="single" w:color="auto" w:sz="4"/>
-          <w:right w:val="single" w:color="auto" w:sz="4"/>
-          <w:insideH w:val="single" w:color="auto" w:sz="4"/>
-          <w:insideV w:val="single" w:color="auto" w:sz="4"/>
+          <w:top w:val="single" w:color="A07820" w:sz="4"/>
+          <w:left w:val="single" w:color="A07820" w:sz="4"/>
+          <w:bottom w:val="single" w:color="A07820" w:sz="4"/>
+          <w:right w:val="single" w:color="A07820" w:sz="4"/>
+          <w:insideH w:val="single" w:color="D9C48A" w:sz="2"/>
+          <w:insideV w:val="single" w:color="D9C48A" w:sz="2"/>
         </w:tblBorders>
       </w:tblPr>
       <w:tblGrid>
@@ -1363,19 +1476,21 @@
         <w:tc>
           <w:tcPr>
             <w:tcW w:type="dxa" w:w="1400"/>
-            <w:shd w:fill="E8E0C8" w:color="auto" w:val="clear"/>
-            <w:tcMar>
-              <w:top w:type="dxa" w:w="80"/>
-              <w:left w:type="dxa" w:w="100"/>
-              <w:bottom w:type="dxa" w:w="80"/>
-              <w:right w:type="dxa" w:w="100"/>
-            </w:tcMar>
-          </w:tcPr>
-          <w:p>
-            <w:r>
-              <w:rPr>
+            <w:shd w:fill="0D0D0D" w:color="auto" w:val="clear"/>
+            <w:tcMar>
+              <w:top w:type="dxa" w:w="90"/>
+              <w:left w:type="dxa" w:w="110"/>
+              <w:bottom w:type="dxa" w:w="90"/>
+              <w:right w:type="dxa" w:w="110"/>
+            </w:tcMar>
+          </w:tcPr>
+          <w:p>
+            <w:r>
+              <w:rPr>
+                <w:rFonts w:ascii="Syne" w:cs="Syne" w:eastAsia="Syne" w:hAnsi="Syne"/>
                 <w:b/>
                 <w:bCs/>
+                <w:color w:val="F2CC6B"/>
                 <w:sz w:val="20"/>
                 <w:szCs w:val="20"/>
               </w:rPr>
@@ -1386,19 +1501,21 @@
         <w:tc>
           <w:tcPr>
             <w:tcW w:type="dxa" w:w="5300"/>
-            <w:shd w:fill="E8E0C8" w:color="auto" w:val="clear"/>
-            <w:tcMar>
-              <w:top w:type="dxa" w:w="80"/>
-              <w:left w:type="dxa" w:w="100"/>
-              <w:bottom w:type="dxa" w:w="80"/>
-              <w:right w:type="dxa" w:w="100"/>
-            </w:tcMar>
-          </w:tcPr>
-          <w:p>
-            <w:r>
-              <w:rPr>
+            <w:shd w:fill="0D0D0D" w:color="auto" w:val="clear"/>
+            <w:tcMar>
+              <w:top w:type="dxa" w:w="90"/>
+              <w:left w:type="dxa" w:w="110"/>
+              <w:bottom w:type="dxa" w:w="90"/>
+              <w:right w:type="dxa" w:w="110"/>
+            </w:tcMar>
+          </w:tcPr>
+          <w:p>
+            <w:r>
+              <w:rPr>
+                <w:rFonts w:ascii="Syne" w:cs="Syne" w:eastAsia="Syne" w:hAnsi="Syne"/>
                 <w:b/>
                 <w:bCs/>
+                <w:color w:val="F2CC6B"/>
                 <w:sz w:val="20"/>
                 <w:szCs w:val="20"/>
               </w:rPr>
@@ -1409,19 +1526,21 @@
         <w:tc>
           <w:tcPr>
             <w:tcW w:type="dxa" w:w="3300"/>
-            <w:shd w:fill="E8E0C8" w:color="auto" w:val="clear"/>
-            <w:tcMar>
-              <w:top w:type="dxa" w:w="80"/>
-              <w:left w:type="dxa" w:w="100"/>
-              <w:bottom w:type="dxa" w:w="80"/>
-              <w:right w:type="dxa" w:w="100"/>
-            </w:tcMar>
-          </w:tcPr>
-          <w:p>
-            <w:r>
-              <w:rPr>
+            <w:shd w:fill="0D0D0D" w:color="auto" w:val="clear"/>
+            <w:tcMar>
+              <w:top w:type="dxa" w:w="90"/>
+              <w:left w:type="dxa" w:w="110"/>
+              <w:bottom w:type="dxa" w:w="90"/>
+              <w:right w:type="dxa" w:w="110"/>
+            </w:tcMar>
+          </w:tcPr>
+          <w:p>
+            <w:r>
+              <w:rPr>
+                <w:rFonts w:ascii="Syne" w:cs="Syne" w:eastAsia="Syne" w:hAnsi="Syne"/>
                 <w:b/>
                 <w:bCs/>
+                <w:color w:val="F2CC6B"/>
                 <w:sz w:val="20"/>
                 <w:szCs w:val="20"/>
               </w:rPr>
@@ -1435,10 +1554,10 @@
           <w:tcPr>
             <w:tcW w:type="dxa" w:w="1400"/>
             <w:tcMar>
-              <w:top w:type="dxa" w:w="80"/>
-              <w:left w:type="dxa" w:w="100"/>
-              <w:bottom w:type="dxa" w:w="80"/>
-              <w:right w:type="dxa" w:w="100"/>
+              <w:top w:type="dxa" w:w="90"/>
+              <w:left w:type="dxa" w:w="110"/>
+              <w:bottom w:type="dxa" w:w="90"/>
+              <w:right w:type="dxa" w:w="110"/>
             </w:tcMar>
           </w:tcPr>
           <w:p>
@@ -1457,10 +1576,10 @@
           <w:tcPr>
             <w:tcW w:type="dxa" w:w="5300"/>
             <w:tcMar>
-              <w:top w:type="dxa" w:w="80"/>
-              <w:left w:type="dxa" w:w="100"/>
-              <w:bottom w:type="dxa" w:w="80"/>
-              <w:right w:type="dxa" w:w="100"/>
+              <w:top w:type="dxa" w:w="90"/>
+              <w:left w:type="dxa" w:w="110"/>
+              <w:bottom w:type="dxa" w:w="90"/>
+              <w:right w:type="dxa" w:w="110"/>
             </w:tcMar>
           </w:tcPr>
           <w:p>
@@ -1479,10 +1598,10 @@
           <w:tcPr>
             <w:tcW w:type="dxa" w:w="3300"/>
             <w:tcMar>
-              <w:top w:type="dxa" w:w="80"/>
-              <w:left w:type="dxa" w:w="100"/>
-              <w:bottom w:type="dxa" w:w="80"/>
-              <w:right w:type="dxa" w:w="100"/>
+              <w:top w:type="dxa" w:w="90"/>
+              <w:left w:type="dxa" w:w="110"/>
+              <w:bottom w:type="dxa" w:w="90"/>
+              <w:right w:type="dxa" w:w="110"/>
             </w:tcMar>
           </w:tcPr>
           <w:p>
@@ -1502,11 +1621,12 @@
         <w:tc>
           <w:tcPr>
             <w:tcW w:type="dxa" w:w="1400"/>
-            <w:tcMar>
-              <w:top w:type="dxa" w:w="80"/>
-              <w:left w:type="dxa" w:w="100"/>
-              <w:bottom w:type="dxa" w:w="80"/>
-              <w:right w:type="dxa" w:w="100"/>
+            <w:shd w:fill="FBF6E8" w:color="auto" w:val="clear"/>
+            <w:tcMar>
+              <w:top w:type="dxa" w:w="90"/>
+              <w:left w:type="dxa" w:w="110"/>
+              <w:bottom w:type="dxa" w:w="90"/>
+              <w:right w:type="dxa" w:w="110"/>
             </w:tcMar>
           </w:tcPr>
           <w:p>
@@ -1524,11 +1644,12 @@
         <w:tc>
           <w:tcPr>
             <w:tcW w:type="dxa" w:w="5300"/>
-            <w:tcMar>
-              <w:top w:type="dxa" w:w="80"/>
-              <w:left w:type="dxa" w:w="100"/>
-              <w:bottom w:type="dxa" w:w="80"/>
-              <w:right w:type="dxa" w:w="100"/>
+            <w:shd w:fill="FBF6E8" w:color="auto" w:val="clear"/>
+            <w:tcMar>
+              <w:top w:type="dxa" w:w="90"/>
+              <w:left w:type="dxa" w:w="110"/>
+              <w:bottom w:type="dxa" w:w="90"/>
+              <w:right w:type="dxa" w:w="110"/>
             </w:tcMar>
           </w:tcPr>
           <w:p>
@@ -1546,11 +1667,12 @@
         <w:tc>
           <w:tcPr>
             <w:tcW w:type="dxa" w:w="3300"/>
-            <w:tcMar>
-              <w:top w:type="dxa" w:w="80"/>
-              <w:left w:type="dxa" w:w="100"/>
-              <w:bottom w:type="dxa" w:w="80"/>
-              <w:right w:type="dxa" w:w="100"/>
+            <w:shd w:fill="FBF6E8" w:color="auto" w:val="clear"/>
+            <w:tcMar>
+              <w:top w:type="dxa" w:w="90"/>
+              <w:left w:type="dxa" w:w="110"/>
+              <w:bottom w:type="dxa" w:w="90"/>
+              <w:right w:type="dxa" w:w="110"/>
             </w:tcMar>
           </w:tcPr>
           <w:p>
@@ -1571,10 +1693,10 @@
           <w:tcPr>
             <w:tcW w:type="dxa" w:w="1400"/>
             <w:tcMar>
-              <w:top w:type="dxa" w:w="80"/>
-              <w:left w:type="dxa" w:w="100"/>
-              <w:bottom w:type="dxa" w:w="80"/>
-              <w:right w:type="dxa" w:w="100"/>
+              <w:top w:type="dxa" w:w="90"/>
+              <w:left w:type="dxa" w:w="110"/>
+              <w:bottom w:type="dxa" w:w="90"/>
+              <w:right w:type="dxa" w:w="110"/>
             </w:tcMar>
           </w:tcPr>
           <w:p>
@@ -1593,10 +1715,10 @@
           <w:tcPr>
             <w:tcW w:type="dxa" w:w="5300"/>
             <w:tcMar>
-              <w:top w:type="dxa" w:w="80"/>
-              <w:left w:type="dxa" w:w="100"/>
-              <w:bottom w:type="dxa" w:w="80"/>
-              <w:right w:type="dxa" w:w="100"/>
+              <w:top w:type="dxa" w:w="90"/>
+              <w:left w:type="dxa" w:w="110"/>
+              <w:bottom w:type="dxa" w:w="90"/>
+              <w:right w:type="dxa" w:w="110"/>
             </w:tcMar>
           </w:tcPr>
           <w:p>
@@ -1615,10 +1737,10 @@
           <w:tcPr>
             <w:tcW w:type="dxa" w:w="3300"/>
             <w:tcMar>
-              <w:top w:type="dxa" w:w="80"/>
-              <w:left w:type="dxa" w:w="100"/>
-              <w:bottom w:type="dxa" w:w="80"/>
-              <w:right w:type="dxa" w:w="100"/>
+              <w:top w:type="dxa" w:w="90"/>
+              <w:left w:type="dxa" w:w="110"/>
+              <w:bottom w:type="dxa" w:w="90"/>
+              <w:right w:type="dxa" w:w="110"/>
             </w:tcMar>
           </w:tcPr>
           <w:p>
@@ -1638,11 +1760,12 @@
         <w:tc>
           <w:tcPr>
             <w:tcW w:type="dxa" w:w="1400"/>
-            <w:tcMar>
-              <w:top w:type="dxa" w:w="80"/>
-              <w:left w:type="dxa" w:w="100"/>
-              <w:bottom w:type="dxa" w:w="80"/>
-              <w:right w:type="dxa" w:w="100"/>
+            <w:shd w:fill="FBF6E8" w:color="auto" w:val="clear"/>
+            <w:tcMar>
+              <w:top w:type="dxa" w:w="90"/>
+              <w:left w:type="dxa" w:w="110"/>
+              <w:bottom w:type="dxa" w:w="90"/>
+              <w:right w:type="dxa" w:w="110"/>
             </w:tcMar>
           </w:tcPr>
           <w:p>
@@ -1660,11 +1783,12 @@
         <w:tc>
           <w:tcPr>
             <w:tcW w:type="dxa" w:w="5300"/>
-            <w:tcMar>
-              <w:top w:type="dxa" w:w="80"/>
-              <w:left w:type="dxa" w:w="100"/>
-              <w:bottom w:type="dxa" w:w="80"/>
-              <w:right w:type="dxa" w:w="100"/>
+            <w:shd w:fill="FBF6E8" w:color="auto" w:val="clear"/>
+            <w:tcMar>
+              <w:top w:type="dxa" w:w="90"/>
+              <w:left w:type="dxa" w:w="110"/>
+              <w:bottom w:type="dxa" w:w="90"/>
+              <w:right w:type="dxa" w:w="110"/>
             </w:tcMar>
           </w:tcPr>
           <w:p>
@@ -1682,11 +1806,12 @@
         <w:tc>
           <w:tcPr>
             <w:tcW w:type="dxa" w:w="3300"/>
-            <w:tcMar>
-              <w:top w:type="dxa" w:w="80"/>
-              <w:left w:type="dxa" w:w="100"/>
-              <w:bottom w:type="dxa" w:w="80"/>
-              <w:right w:type="dxa" w:w="100"/>
+            <w:shd w:fill="FBF6E8" w:color="auto" w:val="clear"/>
+            <w:tcMar>
+              <w:top w:type="dxa" w:w="90"/>
+              <w:left w:type="dxa" w:w="110"/>
+              <w:bottom w:type="dxa" w:w="90"/>
+              <w:right w:type="dxa" w:w="110"/>
             </w:tcMar>
           </w:tcPr>
           <w:p>
@@ -1707,10 +1832,10 @@
           <w:tcPr>
             <w:tcW w:type="dxa" w:w="1400"/>
             <w:tcMar>
-              <w:top w:type="dxa" w:w="80"/>
-              <w:left w:type="dxa" w:w="100"/>
-              <w:bottom w:type="dxa" w:w="80"/>
-              <w:right w:type="dxa" w:w="100"/>
+              <w:top w:type="dxa" w:w="90"/>
+              <w:left w:type="dxa" w:w="110"/>
+              <w:bottom w:type="dxa" w:w="90"/>
+              <w:right w:type="dxa" w:w="110"/>
             </w:tcMar>
           </w:tcPr>
           <w:p>
@@ -1729,10 +1854,10 @@
           <w:tcPr>
             <w:tcW w:type="dxa" w:w="5300"/>
             <w:tcMar>
-              <w:top w:type="dxa" w:w="80"/>
-              <w:left w:type="dxa" w:w="100"/>
-              <w:bottom w:type="dxa" w:w="80"/>
-              <w:right w:type="dxa" w:w="100"/>
+              <w:top w:type="dxa" w:w="90"/>
+              <w:left w:type="dxa" w:w="110"/>
+              <w:bottom w:type="dxa" w:w="90"/>
+              <w:right w:type="dxa" w:w="110"/>
             </w:tcMar>
           </w:tcPr>
           <w:p>
@@ -1751,10 +1876,10 @@
           <w:tcPr>
             <w:tcW w:type="dxa" w:w="3300"/>
             <w:tcMar>
-              <w:top w:type="dxa" w:w="80"/>
-              <w:left w:type="dxa" w:w="100"/>
-              <w:bottom w:type="dxa" w:w="80"/>
-              <w:right w:type="dxa" w:w="100"/>
+              <w:top w:type="dxa" w:w="90"/>
+              <w:left w:type="dxa" w:w="110"/>
+              <w:bottom w:type="dxa" w:w="90"/>
+              <w:right w:type="dxa" w:w="110"/>
             </w:tcMar>
           </w:tcPr>
           <w:p>
@@ -1774,11 +1899,12 @@
         <w:tc>
           <w:tcPr>
             <w:tcW w:type="dxa" w:w="1400"/>
-            <w:tcMar>
-              <w:top w:type="dxa" w:w="80"/>
-              <w:left w:type="dxa" w:w="100"/>
-              <w:bottom w:type="dxa" w:w="80"/>
-              <w:right w:type="dxa" w:w="100"/>
+            <w:shd w:fill="FBF6E8" w:color="auto" w:val="clear"/>
+            <w:tcMar>
+              <w:top w:type="dxa" w:w="90"/>
+              <w:left w:type="dxa" w:w="110"/>
+              <w:bottom w:type="dxa" w:w="90"/>
+              <w:right w:type="dxa" w:w="110"/>
             </w:tcMar>
           </w:tcPr>
           <w:p>
@@ -1796,11 +1922,12 @@
         <w:tc>
           <w:tcPr>
             <w:tcW w:type="dxa" w:w="5300"/>
-            <w:tcMar>
-              <w:top w:type="dxa" w:w="80"/>
-              <w:left w:type="dxa" w:w="100"/>
-              <w:bottom w:type="dxa" w:w="80"/>
-              <w:right w:type="dxa" w:w="100"/>
+            <w:shd w:fill="FBF6E8" w:color="auto" w:val="clear"/>
+            <w:tcMar>
+              <w:top w:type="dxa" w:w="90"/>
+              <w:left w:type="dxa" w:w="110"/>
+              <w:bottom w:type="dxa" w:w="90"/>
+              <w:right w:type="dxa" w:w="110"/>
             </w:tcMar>
           </w:tcPr>
           <w:p>
@@ -1818,11 +1945,12 @@
         <w:tc>
           <w:tcPr>
             <w:tcW w:type="dxa" w:w="3300"/>
-            <w:tcMar>
-              <w:top w:type="dxa" w:w="80"/>
-              <w:left w:type="dxa" w:w="100"/>
-              <w:bottom w:type="dxa" w:w="80"/>
-              <w:right w:type="dxa" w:w="100"/>
+            <w:shd w:fill="FBF6E8" w:color="auto" w:val="clear"/>
+            <w:tcMar>
+              <w:top w:type="dxa" w:w="90"/>
+              <w:left w:type="dxa" w:w="110"/>
+              <w:bottom w:type="dxa" w:w="90"/>
+              <w:right w:type="dxa" w:w="110"/>
             </w:tcMar>
           </w:tcPr>
           <w:p>
@@ -1879,6 +2007,9 @@
     <w:p>
       <w:pPr>
         <w:pStyle w:val="Heading1"/>
+        <w:pBdr>
+          <w:bottom w:val="single" w:color="D4AF37" w:sz="8" w:space="6"/>
+        </w:pBdr>
         <w:spacing w:after="160" w:before="360"/>
       </w:pPr>
       <w:r>
@@ -1984,12 +2115,12 @@
       <w:tblPr>
         <w:tblW w:type="dxa" w:w="10000"/>
         <w:tblBorders>
-          <w:top w:val="single" w:color="auto" w:sz="4"/>
-          <w:left w:val="single" w:color="auto" w:sz="4"/>
-          <w:bottom w:val="single" w:color="auto" w:sz="4"/>
-          <w:right w:val="single" w:color="auto" w:sz="4"/>
-          <w:insideH w:val="single" w:color="auto" w:sz="4"/>
-          <w:insideV w:val="single" w:color="auto" w:sz="4"/>
+          <w:top w:val="single" w:color="A07820" w:sz="4"/>
+          <w:left w:val="single" w:color="A07820" w:sz="4"/>
+          <w:bottom w:val="single" w:color="A07820" w:sz="4"/>
+          <w:right w:val="single" w:color="A07820" w:sz="4"/>
+          <w:insideH w:val="single" w:color="D9C48A" w:sz="2"/>
+          <w:insideV w:val="single" w:color="D9C48A" w:sz="2"/>
         </w:tblBorders>
       </w:tblPr>
       <w:tblGrid>
@@ -2004,19 +2135,21 @@
         <w:tc>
           <w:tcPr>
             <w:tcW w:type="dxa" w:w="3400"/>
-            <w:shd w:fill="E8E0C8" w:color="auto" w:val="clear"/>
-            <w:tcMar>
-              <w:top w:type="dxa" w:w="80"/>
-              <w:left w:type="dxa" w:w="100"/>
-              <w:bottom w:type="dxa" w:w="80"/>
-              <w:right w:type="dxa" w:w="100"/>
-            </w:tcMar>
-          </w:tcPr>
-          <w:p>
-            <w:r>
-              <w:rPr>
+            <w:shd w:fill="0D0D0D" w:color="auto" w:val="clear"/>
+            <w:tcMar>
+              <w:top w:type="dxa" w:w="90"/>
+              <w:left w:type="dxa" w:w="110"/>
+              <w:bottom w:type="dxa" w:w="90"/>
+              <w:right w:type="dxa" w:w="110"/>
+            </w:tcMar>
+          </w:tcPr>
+          <w:p>
+            <w:r>
+              <w:rPr>
+                <w:rFonts w:ascii="Syne" w:cs="Syne" w:eastAsia="Syne" w:hAnsi="Syne"/>
                 <w:b/>
                 <w:bCs/>
+                <w:color w:val="F2CC6B"/>
                 <w:sz w:val="20"/>
                 <w:szCs w:val="20"/>
               </w:rPr>
@@ -2027,19 +2160,21 @@
         <w:tc>
           <w:tcPr>
             <w:tcW w:type="dxa" w:w="3200"/>
-            <w:shd w:fill="E8E0C8" w:color="auto" w:val="clear"/>
-            <w:tcMar>
-              <w:top w:type="dxa" w:w="80"/>
-              <w:left w:type="dxa" w:w="100"/>
-              <w:bottom w:type="dxa" w:w="80"/>
-              <w:right w:type="dxa" w:w="100"/>
-            </w:tcMar>
-          </w:tcPr>
-          <w:p>
-            <w:r>
-              <w:rPr>
+            <w:shd w:fill="0D0D0D" w:color="auto" w:val="clear"/>
+            <w:tcMar>
+              <w:top w:type="dxa" w:w="90"/>
+              <w:left w:type="dxa" w:w="110"/>
+              <w:bottom w:type="dxa" w:w="90"/>
+              <w:right w:type="dxa" w:w="110"/>
+            </w:tcMar>
+          </w:tcPr>
+          <w:p>
+            <w:r>
+              <w:rPr>
+                <w:rFonts w:ascii="Syne" w:cs="Syne" w:eastAsia="Syne" w:hAnsi="Syne"/>
                 <w:b/>
                 <w:bCs/>
+                <w:color w:val="F2CC6B"/>
                 <w:sz w:val="20"/>
                 <w:szCs w:val="20"/>
               </w:rPr>
@@ -2050,19 +2185,21 @@
         <w:tc>
           <w:tcPr>
             <w:tcW w:type="dxa" w:w="3400"/>
-            <w:shd w:fill="E8E0C8" w:color="auto" w:val="clear"/>
-            <w:tcMar>
-              <w:top w:type="dxa" w:w="80"/>
-              <w:left w:type="dxa" w:w="100"/>
-              <w:bottom w:type="dxa" w:w="80"/>
-              <w:right w:type="dxa" w:w="100"/>
-            </w:tcMar>
-          </w:tcPr>
-          <w:p>
-            <w:r>
-              <w:rPr>
+            <w:shd w:fill="0D0D0D" w:color="auto" w:val="clear"/>
+            <w:tcMar>
+              <w:top w:type="dxa" w:w="90"/>
+              <w:left w:type="dxa" w:w="110"/>
+              <w:bottom w:type="dxa" w:w="90"/>
+              <w:right w:type="dxa" w:w="110"/>
+            </w:tcMar>
+          </w:tcPr>
+          <w:p>
+            <w:r>
+              <w:rPr>
+                <w:rFonts w:ascii="Syne" w:cs="Syne" w:eastAsia="Syne" w:hAnsi="Syne"/>
                 <w:b/>
                 <w:bCs/>
+                <w:color w:val="F2CC6B"/>
                 <w:sz w:val="20"/>
                 <w:szCs w:val="20"/>
               </w:rPr>
@@ -2076,10 +2213,10 @@
           <w:tcPr>
             <w:tcW w:type="dxa" w:w="3400"/>
             <w:tcMar>
-              <w:top w:type="dxa" w:w="80"/>
-              <w:left w:type="dxa" w:w="100"/>
-              <w:bottom w:type="dxa" w:w="80"/>
-              <w:right w:type="dxa" w:w="100"/>
+              <w:top w:type="dxa" w:w="90"/>
+              <w:left w:type="dxa" w:w="110"/>
+              <w:bottom w:type="dxa" w:w="90"/>
+              <w:right w:type="dxa" w:w="110"/>
             </w:tcMar>
           </w:tcPr>
           <w:p>
@@ -2098,10 +2235,10 @@
           <w:tcPr>
             <w:tcW w:type="dxa" w:w="3200"/>
             <w:tcMar>
-              <w:top w:type="dxa" w:w="80"/>
-              <w:left w:type="dxa" w:w="100"/>
-              <w:bottom w:type="dxa" w:w="80"/>
-              <w:right w:type="dxa" w:w="100"/>
+              <w:top w:type="dxa" w:w="90"/>
+              <w:left w:type="dxa" w:w="110"/>
+              <w:bottom w:type="dxa" w:w="90"/>
+              <w:right w:type="dxa" w:w="110"/>
             </w:tcMar>
           </w:tcPr>
           <w:p>
@@ -2120,10 +2257,10 @@
           <w:tcPr>
             <w:tcW w:type="dxa" w:w="3400"/>
             <w:tcMar>
-              <w:top w:type="dxa" w:w="80"/>
-              <w:left w:type="dxa" w:w="100"/>
-              <w:bottom w:type="dxa" w:w="80"/>
-              <w:right w:type="dxa" w:w="100"/>
+              <w:top w:type="dxa" w:w="90"/>
+              <w:left w:type="dxa" w:w="110"/>
+              <w:bottom w:type="dxa" w:w="90"/>
+              <w:right w:type="dxa" w:w="110"/>
             </w:tcMar>
           </w:tcPr>
           <w:p>
@@ -2143,11 +2280,12 @@
         <w:tc>
           <w:tcPr>
             <w:tcW w:type="dxa" w:w="3400"/>
-            <w:tcMar>
-              <w:top w:type="dxa" w:w="80"/>
-              <w:left w:type="dxa" w:w="100"/>
-              <w:bottom w:type="dxa" w:w="80"/>
-              <w:right w:type="dxa" w:w="100"/>
+            <w:shd w:fill="FBF6E8" w:color="auto" w:val="clear"/>
+            <w:tcMar>
+              <w:top w:type="dxa" w:w="90"/>
+              <w:left w:type="dxa" w:w="110"/>
+              <w:bottom w:type="dxa" w:w="90"/>
+              <w:right w:type="dxa" w:w="110"/>
             </w:tcMar>
           </w:tcPr>
           <w:p>
@@ -2165,11 +2303,12 @@
         <w:tc>
           <w:tcPr>
             <w:tcW w:type="dxa" w:w="3200"/>
-            <w:tcMar>
-              <w:top w:type="dxa" w:w="80"/>
-              <w:left w:type="dxa" w:w="100"/>
-              <w:bottom w:type="dxa" w:w="80"/>
-              <w:right w:type="dxa" w:w="100"/>
+            <w:shd w:fill="FBF6E8" w:color="auto" w:val="clear"/>
+            <w:tcMar>
+              <w:top w:type="dxa" w:w="90"/>
+              <w:left w:type="dxa" w:w="110"/>
+              <w:bottom w:type="dxa" w:w="90"/>
+              <w:right w:type="dxa" w:w="110"/>
             </w:tcMar>
           </w:tcPr>
           <w:p>
@@ -2187,11 +2326,12 @@
         <w:tc>
           <w:tcPr>
             <w:tcW w:type="dxa" w:w="3400"/>
-            <w:tcMar>
-              <w:top w:type="dxa" w:w="80"/>
-              <w:left w:type="dxa" w:w="100"/>
-              <w:bottom w:type="dxa" w:w="80"/>
-              <w:right w:type="dxa" w:w="100"/>
+            <w:shd w:fill="FBF6E8" w:color="auto" w:val="clear"/>
+            <w:tcMar>
+              <w:top w:type="dxa" w:w="90"/>
+              <w:left w:type="dxa" w:w="110"/>
+              <w:bottom w:type="dxa" w:w="90"/>
+              <w:right w:type="dxa" w:w="110"/>
             </w:tcMar>
           </w:tcPr>
           <w:p>
@@ -2420,6 +2560,9 @@
     <w:p>
       <w:pPr>
         <w:pStyle w:val="Heading1"/>
+        <w:pBdr>
+          <w:bottom w:val="single" w:color="D4AF37" w:sz="8" w:space="6"/>
+        </w:pBdr>
         <w:spacing w:after="160" w:before="360"/>
       </w:pPr>
       <w:r>
@@ -2430,12 +2573,12 @@
       <w:tblPr>
         <w:tblW w:type="dxa" w:w="9700"/>
         <w:tblBorders>
-          <w:top w:val="single" w:color="auto" w:sz="4"/>
-          <w:left w:val="single" w:color="auto" w:sz="4"/>
-          <w:bottom w:val="single" w:color="auto" w:sz="4"/>
-          <w:right w:val="single" w:color="auto" w:sz="4"/>
-          <w:insideH w:val="single" w:color="auto" w:sz="4"/>
-          <w:insideV w:val="single" w:color="auto" w:sz="4"/>
+          <w:top w:val="single" w:color="A07820" w:sz="4"/>
+          <w:left w:val="single" w:color="A07820" w:sz="4"/>
+          <w:bottom w:val="single" w:color="A07820" w:sz="4"/>
+          <w:right w:val="single" w:color="A07820" w:sz="4"/>
+          <w:insideH w:val="single" w:color="D9C48A" w:sz="2"/>
+          <w:insideV w:val="single" w:color="D9C48A" w:sz="2"/>
         </w:tblBorders>
       </w:tblPr>
       <w:tblGrid>
@@ -2451,19 +2594,21 @@
         <w:tc>
           <w:tcPr>
             <w:tcW w:type="dxa" w:w="2600"/>
-            <w:shd w:fill="E8E0C8" w:color="auto" w:val="clear"/>
-            <w:tcMar>
-              <w:top w:type="dxa" w:w="80"/>
-              <w:left w:type="dxa" w:w="100"/>
-              <w:bottom w:type="dxa" w:w="80"/>
-              <w:right w:type="dxa" w:w="100"/>
-            </w:tcMar>
-          </w:tcPr>
-          <w:p>
-            <w:r>
-              <w:rPr>
+            <w:shd w:fill="0D0D0D" w:color="auto" w:val="clear"/>
+            <w:tcMar>
+              <w:top w:type="dxa" w:w="90"/>
+              <w:left w:type="dxa" w:w="110"/>
+              <w:bottom w:type="dxa" w:w="90"/>
+              <w:right w:type="dxa" w:w="110"/>
+            </w:tcMar>
+          </w:tcPr>
+          <w:p>
+            <w:r>
+              <w:rPr>
+                <w:rFonts w:ascii="Syne" w:cs="Syne" w:eastAsia="Syne" w:hAnsi="Syne"/>
                 <w:b/>
                 <w:bCs/>
+                <w:color w:val="F2CC6B"/>
                 <w:sz w:val="20"/>
                 <w:szCs w:val="20"/>
               </w:rPr>
@@ -2474,19 +2619,21 @@
         <w:tc>
           <w:tcPr>
             <w:tcW w:type="dxa" w:w="2600"/>
-            <w:shd w:fill="E8E0C8" w:color="auto" w:val="clear"/>
-            <w:tcMar>
-              <w:top w:type="dxa" w:w="80"/>
-              <w:left w:type="dxa" w:w="100"/>
-              <w:bottom w:type="dxa" w:w="80"/>
-              <w:right w:type="dxa" w:w="100"/>
-            </w:tcMar>
-          </w:tcPr>
-          <w:p>
-            <w:r>
-              <w:rPr>
+            <w:shd w:fill="0D0D0D" w:color="auto" w:val="clear"/>
+            <w:tcMar>
+              <w:top w:type="dxa" w:w="90"/>
+              <w:left w:type="dxa" w:w="110"/>
+              <w:bottom w:type="dxa" w:w="90"/>
+              <w:right w:type="dxa" w:w="110"/>
+            </w:tcMar>
+          </w:tcPr>
+          <w:p>
+            <w:r>
+              <w:rPr>
+                <w:rFonts w:ascii="Syne" w:cs="Syne" w:eastAsia="Syne" w:hAnsi="Syne"/>
                 <w:b/>
                 <w:bCs/>
+                <w:color w:val="F2CC6B"/>
                 <w:sz w:val="20"/>
                 <w:szCs w:val="20"/>
               </w:rPr>
@@ -2497,19 +2644,21 @@
         <w:tc>
           <w:tcPr>
             <w:tcW w:type="dxa" w:w="2600"/>
-            <w:shd w:fill="E8E0C8" w:color="auto" w:val="clear"/>
-            <w:tcMar>
-              <w:top w:type="dxa" w:w="80"/>
-              <w:left w:type="dxa" w:w="100"/>
-              <w:bottom w:type="dxa" w:w="80"/>
-              <w:right w:type="dxa" w:w="100"/>
-            </w:tcMar>
-          </w:tcPr>
-          <w:p>
-            <w:r>
-              <w:rPr>
+            <w:shd w:fill="0D0D0D" w:color="auto" w:val="clear"/>
+            <w:tcMar>
+              <w:top w:type="dxa" w:w="90"/>
+              <w:left w:type="dxa" w:w="110"/>
+              <w:bottom w:type="dxa" w:w="90"/>
+              <w:right w:type="dxa" w:w="110"/>
+            </w:tcMar>
+          </w:tcPr>
+          <w:p>
+            <w:r>
+              <w:rPr>
+                <w:rFonts w:ascii="Syne" w:cs="Syne" w:eastAsia="Syne" w:hAnsi="Syne"/>
                 <w:b/>
                 <w:bCs/>
+                <w:color w:val="F2CC6B"/>
                 <w:sz w:val="20"/>
                 <w:szCs w:val="20"/>
               </w:rPr>
@@ -2520,19 +2669,21 @@
         <w:tc>
           <w:tcPr>
             <w:tcW w:type="dxa" w:w="1900"/>
-            <w:shd w:fill="E8E0C8" w:color="auto" w:val="clear"/>
-            <w:tcMar>
-              <w:top w:type="dxa" w:w="80"/>
-              <w:left w:type="dxa" w:w="100"/>
-              <w:bottom w:type="dxa" w:w="80"/>
-              <w:right w:type="dxa" w:w="100"/>
-            </w:tcMar>
-          </w:tcPr>
-          <w:p>
-            <w:r>
-              <w:rPr>
+            <w:shd w:fill="0D0D0D" w:color="auto" w:val="clear"/>
+            <w:tcMar>
+              <w:top w:type="dxa" w:w="90"/>
+              <w:left w:type="dxa" w:w="110"/>
+              <w:bottom w:type="dxa" w:w="90"/>
+              <w:right w:type="dxa" w:w="110"/>
+            </w:tcMar>
+          </w:tcPr>
+          <w:p>
+            <w:r>
+              <w:rPr>
+                <w:rFonts w:ascii="Syne" w:cs="Syne" w:eastAsia="Syne" w:hAnsi="Syne"/>
                 <w:b/>
                 <w:bCs/>
+                <w:color w:val="F2CC6B"/>
                 <w:sz w:val="20"/>
                 <w:szCs w:val="20"/>
               </w:rPr>
@@ -2546,10 +2697,10 @@
           <w:tcPr>
             <w:tcW w:type="dxa" w:w="2600"/>
             <w:tcMar>
-              <w:top w:type="dxa" w:w="80"/>
-              <w:left w:type="dxa" w:w="100"/>
-              <w:bottom w:type="dxa" w:w="80"/>
-              <w:right w:type="dxa" w:w="100"/>
+              <w:top w:type="dxa" w:w="90"/>
+              <w:left w:type="dxa" w:w="110"/>
+              <w:bottom w:type="dxa" w:w="90"/>
+              <w:right w:type="dxa" w:w="110"/>
             </w:tcMar>
           </w:tcPr>
           <w:p>
@@ -2568,10 +2719,10 @@
           <w:tcPr>
             <w:tcW w:type="dxa" w:w="2600"/>
             <w:tcMar>
-              <w:top w:type="dxa" w:w="80"/>
-              <w:left w:type="dxa" w:w="100"/>
-              <w:bottom w:type="dxa" w:w="80"/>
-              <w:right w:type="dxa" w:w="100"/>
+              <w:top w:type="dxa" w:w="90"/>
+              <w:left w:type="dxa" w:w="110"/>
+              <w:bottom w:type="dxa" w:w="90"/>
+              <w:right w:type="dxa" w:w="110"/>
             </w:tcMar>
           </w:tcPr>
           <w:p>
@@ -2590,10 +2741,10 @@
           <w:tcPr>
             <w:tcW w:type="dxa" w:w="2600"/>
             <w:tcMar>
-              <w:top w:type="dxa" w:w="80"/>
-              <w:left w:type="dxa" w:w="100"/>
-              <w:bottom w:type="dxa" w:w="80"/>
-              <w:right w:type="dxa" w:w="100"/>
+              <w:top w:type="dxa" w:w="90"/>
+              <w:left w:type="dxa" w:w="110"/>
+              <w:bottom w:type="dxa" w:w="90"/>
+              <w:right w:type="dxa" w:w="110"/>
             </w:tcMar>
           </w:tcPr>
           <w:p>
@@ -2612,10 +2763,10 @@
           <w:tcPr>
             <w:tcW w:type="dxa" w:w="1900"/>
             <w:tcMar>
-              <w:top w:type="dxa" w:w="80"/>
-              <w:left w:type="dxa" w:w="100"/>
-              <w:bottom w:type="dxa" w:w="80"/>
-              <w:right w:type="dxa" w:w="100"/>
+              <w:top w:type="dxa" w:w="90"/>
+              <w:left w:type="dxa" w:w="110"/>
+              <w:bottom w:type="dxa" w:w="90"/>
+              <w:right w:type="dxa" w:w="110"/>
             </w:tcMar>
           </w:tcPr>
           <w:p>
@@ -2643,6 +2794,9 @@
     <w:p>
       <w:pPr>
         <w:pStyle w:val="Heading1"/>
+        <w:pBdr>
+          <w:bottom w:val="single" w:color="D4AF37" w:sz="8" w:space="6"/>
+        </w:pBdr>
         <w:spacing w:after="160" w:before="360"/>
       </w:pPr>
       <w:r>
@@ -2757,7 +2911,7 @@
       <w:headerReference w:type="default" r:id="rId7"/>
       <w:footerReference w:type="default" r:id="rId8"/>
       <w:pgSz w:w="12240" w:h="15840" w:orient="portrait"/>
-      <w:pgMar w:top="1080" w:right="1080" w:bottom="1080" w:left="1080" w:header="708" w:footer="708" w:gutter="0"/>
+      <w:pgMar w:top="1300" w:right="1080" w:bottom="1080" w:left="1080" w:header="708" w:footer="708" w:gutter="0"/>
       <w:pgNumType/>
       <w:docGrid w:linePitch="360"/>
     </w:sectPr>
@@ -2810,6 +2964,9 @@
 <w:ftr xmlns:wpc="http://schemas.microsoft.com/office/word/2010/wordprocessingCanvas" xmlns:mc="http://schemas.openxmlformats.org/markup-compatibility/2006" xmlns:o="urn:schemas-microsoft-com:office:office" xmlns:r="http://schemas.openxmlformats.org/officeDocument/2006/relationships" xmlns:m="http://schemas.openxmlformats.org/officeDocument/2006/math" xmlns:v="urn:schemas-microsoft-com:vml" xmlns:wp14="http://schemas.microsoft.com/office/word/2010/wordprocessingDrawing" xmlns:wp="http://schemas.openxmlformats.org/drawingml/2006/wordprocessingDrawing" xmlns:w10="urn:schemas-microsoft-com:office:word" xmlns:w="http://schemas.openxmlformats.org/wordprocessingml/2006/main" xmlns:w14="http://schemas.microsoft.com/office/word/2010/wordml" xmlns:w15="http://schemas.microsoft.com/office/word/2012/wordml" xmlns:wpg="http://schemas.microsoft.com/office/word/2010/wordprocessingGroup" xmlns:wpi="http://schemas.microsoft.com/office/word/2010/wordprocessingInk" xmlns:wne="http://schemas.microsoft.com/office/word/2006/wordml" xmlns:wps="http://schemas.microsoft.com/office/word/2010/wordprocessingShape">
   <w:p>
     <w:pPr>
+      <w:pBdr>
+        <w:top w:val="single" w:color="F2CC6B" w:sz="4" w:space="4"/>
+      </w:pBdr>
       <w:jc w:val="center"/>
     </w:pPr>
     <w:r>
@@ -2818,7 +2975,7 @@
         <w:sz w:val="16"/>
         <w:szCs w:val="16"/>
       </w:rPr>
-      <w:t xml:space="preserve">Page </w:t>
+      <w:t xml:space="preserve">Etel Family Technology and Business Group  ·  Page </w:t>
     </w:r>
     <w:r>
       <w:rPr>
@@ -2895,15 +3052,61 @@
 <w:hdr xmlns:wpc="http://schemas.microsoft.com/office/word/2010/wordprocessingCanvas" xmlns:mc="http://schemas.openxmlformats.org/markup-compatibility/2006" xmlns:o="urn:schemas-microsoft-com:office:office" xmlns:r="http://schemas.openxmlformats.org/officeDocument/2006/relationships" xmlns:m="http://schemas.openxmlformats.org/officeDocument/2006/math" xmlns:v="urn:schemas-microsoft-com:vml" xmlns:wp14="http://schemas.microsoft.com/office/word/2010/wordprocessingDrawing" xmlns:wp="http://schemas.openxmlformats.org/drawingml/2006/wordprocessingDrawing" xmlns:w10="urn:schemas-microsoft-com:office:word" xmlns:w="http://schemas.openxmlformats.org/wordprocessingml/2006/main" xmlns:w14="http://schemas.microsoft.com/office/word/2010/wordml" xmlns:w15="http://schemas.microsoft.com/office/word/2012/wordml" xmlns:wpg="http://schemas.microsoft.com/office/word/2010/wordprocessingGroup" xmlns:wpi="http://schemas.microsoft.com/office/word/2010/wordprocessingInk" xmlns:wne="http://schemas.microsoft.com/office/word/2006/wordml" xmlns:wps="http://schemas.microsoft.com/office/word/2010/wordprocessingShape" xmlns:cx="http://schemas.microsoft.com/office/drawing/2014/chartex" xmlns:cx1="http://schemas.microsoft.com/office/drawing/2015/9/8/chartex" xmlns:cx2="http://schemas.microsoft.com/office/drawing/2015/10/21/chartex" xmlns:cx3="http://schemas.microsoft.com/office/drawing/2016/5/9/chartex" xmlns:cx4="http://schemas.microsoft.com/office/drawing/2016/5/10/chartex" xmlns:cx5="http://schemas.microsoft.com/office/drawing/2016/5/11/chartex" xmlns:cx6="http://schemas.microsoft.com/office/drawing/2016/5/12/chartex" xmlns:cx7="http://schemas.microsoft.com/office/drawing/2016/5/13/chartex" xmlns:cx8="http://schemas.microsoft.com/office/drawing/2016/5/14/chartex" xmlns:w16cid="http://schemas.microsoft.com/office/word/2016/wordml/cid" xmlns:w16se="http://schemas.microsoft.com/office/word/2015/wordml/symex">
   <w:p>
     <w:pPr>
+      <w:pBdr>
+        <w:bottom w:val="single" w:color="D4AF37" w:sz="6" w:space="4"/>
+      </w:pBdr>
       <w:jc w:val="right"/>
     </w:pPr>
     <w:r>
+      <w:drawing>
+        <wp:inline distT="0" distB="0" distL="0" distR="0">
+          <wp:extent cx="209550" cy="209550"/>
+          <wp:effectExtent t="0" r="0" b="0" l="0"/>
+          <wp:docPr id="1" name="" descr="" title=""/>
+          <wp:cNvGraphicFramePr>
+            <a:graphicFrameLocks xmlns:a="http://schemas.openxmlformats.org/drawingml/2006/main" noChangeAspect="1"/>
+          </wp:cNvGraphicFramePr>
+          <a:graphic xmlns:a="http://schemas.openxmlformats.org/drawingml/2006/main">
+            <a:graphicData uri="http://schemas.openxmlformats.org/drawingml/2006/picture">
+              <pic:pic xmlns:pic="http://schemas.openxmlformats.org/drawingml/2006/picture">
+                <pic:nvPicPr>
+                  <pic:cNvPr id="0" name="" descr=""/>
+                  <pic:cNvPicPr>
+                    <a:picLocks noChangeAspect="1" noChangeArrowheads="1"/>
+                  </pic:cNvPicPr>
+                </pic:nvPicPr>
+                <pic:blipFill>
+                  <a:blip r:embed="rId0" cstate="none"/>
+                  <a:srcRect/>
+                  <a:stretch>
+                    <a:fillRect/>
+                  </a:stretch>
+                </pic:blipFill>
+                <pic:spPr bwMode="auto">
+                  <a:xfrm>
+                    <a:off x="0" y="0"/>
+                    <a:ext cx="209550" cy="209550"/>
+                  </a:xfrm>
+                  <a:prstGeom prst="rect">
+                    <a:avLst/>
+                  </a:prstGeom>
+                </pic:spPr>
+              </pic:pic>
+            </a:graphicData>
+          </a:graphic>
+        </wp:inline>
+      </w:drawing>
+    </w:r>
+    <w:r>
       <w:rPr>
-        <w:color w:val="5D6D7E"/>
+        <w:rFonts w:ascii="Syne" w:cs="Syne" w:eastAsia="Syne" w:hAnsi="Syne"/>
+        <w:b/>
+        <w:bCs/>
+        <w:color w:val="A07820"/>
         <w:sz w:val="16"/>
         <w:szCs w:val="16"/>
       </w:rPr>
-      <w:t xml:space="preserve">EtelGebeya — INSA Audit Package</w:t>
+      <w:t xml:space="preserve">  EtelGebeya — INSA Audit Package</w:t>
     </w:r>
   </w:p>
 </w:hdr>
@@ -3198,10 +3401,10 @@
       <w:outlineLvl w:val="0"/>
     </w:pPr>
     <w:rPr>
-      <w:rFonts w:ascii="Calibri" w:cs="Calibri" w:eastAsia="Calibri" w:hAnsi="Calibri"/>
+      <w:rFonts w:ascii="Syne" w:cs="Syne" w:eastAsia="Syne" w:hAnsi="Syne"/>
       <w:b/>
       <w:bCs/>
-      <w:color w:val="9C7A2E"/>
+      <w:color w:val="A07820"/>
       <w:sz w:val="32"/>
       <w:szCs w:val="32"/>
     </w:rPr>
@@ -3216,7 +3419,7 @@
       <w:outlineLvl w:val="1"/>
     </w:pPr>
     <w:rPr>
-      <w:rFonts w:ascii="Calibri" w:cs="Calibri" w:eastAsia="Calibri" w:hAnsi="Calibri"/>
+      <w:rFonts w:ascii="Syne" w:cs="Syne" w:eastAsia="Syne" w:hAnsi="Syne"/>
       <w:b/>
       <w:bCs/>
       <w:color w:val="1B1B1B"/>
@@ -3234,12 +3437,12 @@
       <w:outlineLvl w:val="2"/>
     </w:pPr>
     <w:rPr>
-      <w:rFonts w:ascii="Calibri" w:cs="Calibri" w:eastAsia="Calibri" w:hAnsi="Calibri"/>
+      <w:rFonts w:ascii="Syne" w:cs="Syne" w:eastAsia="Syne" w:hAnsi="Syne"/>
       <w:b/>
       <w:bCs/>
       <w:i/>
       <w:iCs/>
-      <w:color w:val="5D6D7E"/>
+      <w:color w:val="A07820"/>
       <w:sz w:val="23"/>
       <w:szCs w:val="23"/>
     </w:rPr>

</xml_diff>

<commit_message>
docs: add 8.8 Re-Audit Update section to EtelGebeya INSA package
Documents the 2026-09-21 re-audit of the three new NFC service
endpoints (service_nfc_order_list, service_nfc_check_courier,
service_nfc_order_confirm) merged in #217 - error-message leak and
race-condition fixes - matching the same addendum pattern already
used for the Delivery & Ride audit package.

Co-Authored-By: Claude Sonnet 5 <noreply@anthropic.com>
Claude-Session: https://claude.ai/code/session_0128uJ4AqFvT2QYuN1cWX6W6
</commit_message>
<xml_diff>
--- a/docs/INSA_Audit_Package_EtelGebeya.docx
+++ b/docs/INSA_Audit_Package_EtelGebeya.docx
@@ -2555,6 +2555,68 @@
           <w:color w:val="C0392B"/>
         </w:rPr>
         <w:t xml:space="preserve">[TO COMPLETE: Capture a real request/response pair — multipart form body (product fields + up to N image files), CSRF token; response redirects to the vendor's product list on success.]</w:t>
+      </w:r>
+    </w:p>
+    <w:p>
+      <w:pPr>
+        <w:pStyle w:val="Heading2"/>
+      </w:pPr>
+      <w:r>
+        <w:t>8.8 Re-Audit Update — 2026-09-21</w:t>
+      </w:r>
+    </w:p>
+    <w:p>
+      <w:r>
+        <w:t>A second pass was performed after this package was first prepared, scoped to code added to the Etel Gebeya codebase since the original audit: three new server-to-server NFC endpoints (api/service_nfc_order_list.php, api/service_nfc_check_courier.php, api/service_nfc_order_confirm.php) added to extend the EtelID NFC card into Etel Gebeya, letting a courier tap their card to list and confirm their assigned deliveries. None of these existed when Sections 1-8 above were written. Full detail, including every file/line/function cited, lives in this repository's own docs/INSA_FINDINGS_EtelGebeya.md, Section 9; this subsection summarizes the outcome for the audit package.</w:t>
+      </w:r>
+    </w:p>
+    <w:p>
+      <w:pPr>
+        <w:pStyle w:val="Heading3"/>
+      </w:pPr>
+      <w:r>
+        <w:t>Findings</w:t>
+      </w:r>
+    </w:p>
+    <w:p>
+      <w:pPr>
+        <w:pStyle w:val="ListParagraph"/>
+        <w:numPr>
+          <w:ilvl w:val="0"/>
+          <w:numId w:val="1"/>
+        </w:numPr>
+      </w:pPr>
+      <w:r>
+        <w:rPr>
+          <w:b/>
+        </w:rPr>
+        <w:t xml:space="preserve">Clean: </w:t>
+      </w:r>
+      <w:r>
+        <w:t>service_nfc_order_list.php and service_nfc_check_courier.php — verified clean. Both are read-only, gated by the same shared ETELID_SERVICE_KEY mechanism (with the CHANGE_ME placeholder correctly rejected), and scope every result to the courier resolved from the caller's own phone number, so a courier can only see their own assigned deliveries — no IDOR.</w:t>
+      </w:r>
+    </w:p>
+    <w:p>
+      <w:pPr>
+        <w:pStyle w:val="ListParagraph"/>
+        <w:numPr>
+          <w:ilvl w:val="0"/>
+          <w:numId w:val="1"/>
+        </w:numPr>
+      </w:pPr>
+      <w:r>
+        <w:rPr>
+          <w:b/>
+        </w:rPr>
+        <w:t xml:space="preserve">Fixed (Medium severity, both findings): </w:t>
+      </w:r>
+      <w:r>
+        <w:t>service_nfc_order_confirm.php — two findings, both fixed. (1) Error-message info leak: the catch block returned the raw exception text directly in the HTTP response body, the same class of bug already found and fixed elsewhere in this session's audit sweep (Delivery &amp; Ride, EtelPay, Etel Madeya). Fixed by logging the real message server-side only and returning a generic message to the caller. (2) Race condition: the confirm-delivery status update was a SELECT-then-UPDATE, not atomic, so two concurrent confirm taps for the same order_vendor_id could both pass the not-yet-delivered check and both proceed to log the delivery and increment the courier's total_deliveries counter, double-counting a single delivery. Fixed with an atomic status flip -- UPDATE order_vendors SET status='delivered', ... WHERE id=? AND status NOT IN ('delivered','cancelled','returned'), checked via rowCount() -- so only the request that actually wins the flip proceeds; a losing concurrent request gets a clean "Already confirmed delivered" error instead. Same pattern already used for EtelPay's dispute-resolution double-refund fix earlier in this session.</w:t>
+      </w:r>
+    </w:p>
+    <w:p>
+      <w:r>
+        <w:t>Both fixes were verified with php -l (no syntax errors) and the project's ASCII-purity check (no non-ASCII bytes present or introduced). Updated endpoint count: the ~46 legacy api/admin.php actions and ~27 MVC routes counted in Section 8.3 plus these 3 new service-to-service endpoints.</w:t>
       </w:r>
     </w:p>
     <w:p>

</xml_diff>